<commit_message>
Polish all deliverables: cohesive chart style, TOC in both docs, added illustrations (floor plan, stock ageing, top-20)
- _util.apply_style(): one premium matplotlib style (font/grid/spines/palette) across every chart; all charts regenerated
- build_report + build_report_d2: Table of Contents after cover
- D1: added recommended-concept floor plan, stock-ageing and top-20 illustrations

Co-Authored-By: Claude Opus 4.8 <noreply@anthropic.com>
</commit_message>
<xml_diff>
--- a/deliverables/Deliverable_1_Analysis.docx
+++ b/deliverables/Deliverable_1_Analysis.docx
@@ -344,6 +344,37 @@
           <w:sz w:val="18"/>
         </w:rPr>
         <w:t>This draft covers Deliverable 1 end-to-end: data analysis, storage-capacity feasibility, three design options, policy pre-selection, equipment, and a recommended concept with a decision matrix. All figures are measured from the provided Assa Abloy data or computed by the analysis scripts; nothing is fabricated, and open assumptions are listed in Section 13.</w:t>
+      </w:r>
+    </w:p>
+    <w:p>
+      <w:r>
+        <w:br w:type="page"/>
+      </w:r>
+    </w:p>
+    <w:p>
+      <w:pPr>
+        <w:pStyle w:val="Heading1"/>
+      </w:pPr>
+      <w:r>
+        <w:t>Contents</w:t>
+      </w:r>
+    </w:p>
+    <w:p>
+      <w:fldSimple w:instr="TOC \o &quot;1-2&quot; \h \z \u">
+        <w:t>(In Word: right-click → Update Field to build the table of contents.)</w:t>
+      </w:fldSimple>
+    </w:p>
+    <w:p>
+      <w:pPr>
+        <w:spacing w:after="40"/>
+      </w:pPr>
+      <w:r>
+        <w:rPr>
+          <w:b w:val="0"/>
+          <w:i w:val="0"/>
+          <w:color w:val="222222"/>
+          <w:sz w:val="21"/>
+        </w:rPr>
       </w:r>
     </w:p>
     <w:p>
@@ -802,7 +833,7 @@
       <w:r>
         <w:drawing>
           <wp:inline xmlns:a="http://schemas.openxmlformats.org/drawingml/2006/main" xmlns:pic="http://schemas.openxmlformats.org/drawingml/2006/picture">
-            <wp:extent cx="4320000" cy="2698435"/>
+            <wp:extent cx="4320000" cy="2715066"/>
             <wp:docPr id="1" name="Picture 1"/>
             <wp:cNvGraphicFramePr>
               <a:graphicFrameLocks noChangeAspect="1"/>
@@ -823,7 +854,7 @@
                   <pic:spPr>
                     <a:xfrm>
                       <a:off x="0" y="0"/>
-                      <a:ext cx="4320000" cy="2698435"/>
+                      <a:ext cx="4320000" cy="2715066"/>
                     </a:xfrm>
                     <a:prstGeom prst="rect"/>
                   </pic:spPr>
@@ -1368,7 +1399,7 @@
       <w:r>
         <w:drawing>
           <wp:inline xmlns:a="http://schemas.openxmlformats.org/drawingml/2006/main" xmlns:pic="http://schemas.openxmlformats.org/drawingml/2006/picture">
-            <wp:extent cx="4680000" cy="2665905"/>
+            <wp:extent cx="4680000" cy="2721086"/>
             <wp:docPr id="2" name="Picture 2"/>
             <wp:cNvGraphicFramePr>
               <a:graphicFrameLocks noChangeAspect="1"/>
@@ -1389,7 +1420,7 @@
                   <pic:spPr>
                     <a:xfrm>
                       <a:off x="0" y="0"/>
-                      <a:ext cx="4680000" cy="2665905"/>
+                      <a:ext cx="4680000" cy="2721086"/>
                     </a:xfrm>
                     <a:prstGeom prst="rect"/>
                   </pic:spPr>
@@ -1413,6 +1444,60 @@
           <w:sz w:val="17"/>
         </w:rPr>
         <w:t>Fig 2. Inventory footprint trend, Q2 2025 (loads and occupied locations).</w:t>
+      </w:r>
+    </w:p>
+    <w:p>
+      <w:pPr>
+        <w:jc w:val="center"/>
+      </w:pPr>
+      <w:r>
+        <w:drawing>
+          <wp:inline xmlns:a="http://schemas.openxmlformats.org/drawingml/2006/main" xmlns:pic="http://schemas.openxmlformats.org/drawingml/2006/picture">
+            <wp:extent cx="4680000" cy="2743650"/>
+            <wp:docPr id="3" name="Picture 3"/>
+            <wp:cNvGraphicFramePr>
+              <a:graphicFrameLocks noChangeAspect="1"/>
+            </wp:cNvGraphicFramePr>
+            <a:graphic>
+              <a:graphicData uri="http://schemas.openxmlformats.org/drawingml/2006/picture">
+                <pic:pic>
+                  <pic:nvPicPr>
+                    <pic:cNvPr id="0" name="report_stock_ageing.png"/>
+                    <pic:cNvPicPr/>
+                  </pic:nvPicPr>
+                  <pic:blipFill>
+                    <a:blip r:embed="rId11"/>
+                    <a:stretch>
+                      <a:fillRect/>
+                    </a:stretch>
+                  </pic:blipFill>
+                  <pic:spPr>
+                    <a:xfrm>
+                      <a:off x="0" y="0"/>
+                      <a:ext cx="4680000" cy="2743650"/>
+                    </a:xfrm>
+                    <a:prstGeom prst="rect"/>
+                  </pic:spPr>
+                </pic:pic>
+              </a:graphicData>
+            </a:graphic>
+          </wp:inline>
+        </w:drawing>
+      </w:r>
+    </w:p>
+    <w:p>
+      <w:pPr>
+        <w:spacing w:after="200"/>
+        <w:jc w:val="center"/>
+      </w:pPr>
+      <w:r>
+        <w:rPr>
+          <w:b w:val="0"/>
+          <w:i/>
+          <w:color w:val="666666"/>
+          <w:sz w:val="17"/>
+        </w:rPr>
+        <w:t>Fig 2b. Stock ageing — 21% of loads have been in stock &gt;1 year (dead-stock signal).</w:t>
       </w:r>
     </w:p>
     <w:p>
@@ -1973,8 +2058,8 @@
       <w:r>
         <w:drawing>
           <wp:inline xmlns:a="http://schemas.openxmlformats.org/drawingml/2006/main" xmlns:pic="http://schemas.openxmlformats.org/drawingml/2006/picture">
-            <wp:extent cx="3960000" cy="2640000"/>
-            <wp:docPr id="3" name="Picture 3"/>
+            <wp:extent cx="3960000" cy="2668411"/>
+            <wp:docPr id="4" name="Picture 4"/>
             <wp:cNvGraphicFramePr>
               <a:graphicFrameLocks noChangeAspect="1"/>
             </wp:cNvGraphicFramePr>
@@ -1986,7 +2071,7 @@
                     <pic:cNvPicPr/>
                   </pic:nvPicPr>
                   <pic:blipFill>
-                    <a:blip r:embed="rId11"/>
+                    <a:blip r:embed="rId12"/>
                     <a:stretch>
                       <a:fillRect/>
                     </a:stretch>
@@ -1994,7 +2079,7 @@
                   <pic:spPr>
                     <a:xfrm>
                       <a:off x="0" y="0"/>
-                      <a:ext cx="3960000" cy="2640000"/>
+                      <a:ext cx="3960000" cy="2668411"/>
                     </a:xfrm>
                     <a:prstGeom prst="rect"/>
                   </pic:spPr>
@@ -2687,8 +2772,8 @@
       <w:r>
         <w:drawing>
           <wp:inline xmlns:a="http://schemas.openxmlformats.org/drawingml/2006/main" xmlns:pic="http://schemas.openxmlformats.org/drawingml/2006/picture">
-            <wp:extent cx="4680000" cy="2966294"/>
-            <wp:docPr id="4" name="Picture 4"/>
+            <wp:extent cx="4680000" cy="2976285"/>
+            <wp:docPr id="5" name="Picture 5"/>
             <wp:cNvGraphicFramePr>
               <a:graphicFrameLocks noChangeAspect="1"/>
             </wp:cNvGraphicFramePr>
@@ -2700,7 +2785,7 @@
                     <pic:cNvPicPr/>
                   </pic:nvPicPr>
                   <pic:blipFill>
-                    <a:blip r:embed="rId12"/>
+                    <a:blip r:embed="rId13"/>
                     <a:stretch>
                       <a:fillRect/>
                     </a:stretch>
@@ -2708,7 +2793,7 @@
                   <pic:spPr>
                     <a:xfrm>
                       <a:off x="0" y="0"/>
-                      <a:ext cx="4680000" cy="2966294"/>
+                      <a:ext cx="4680000" cy="2976285"/>
                     </a:xfrm>
                     <a:prstGeom prst="rect"/>
                   </pic:spPr>
@@ -2732,6 +2817,60 @@
           <w:sz w:val="17"/>
         </w:rPr>
         <w:t>Fig 4. Demand Pareto — cumulative picked quantity vs ranked SKUs.</w:t>
+      </w:r>
+    </w:p>
+    <w:p>
+      <w:pPr>
+        <w:jc w:val="center"/>
+      </w:pPr>
+      <w:r>
+        <w:drawing>
+          <wp:inline xmlns:a="http://schemas.openxmlformats.org/drawingml/2006/main" xmlns:pic="http://schemas.openxmlformats.org/drawingml/2006/picture">
+            <wp:extent cx="5400000" cy="4149817"/>
+            <wp:docPr id="6" name="Picture 6"/>
+            <wp:cNvGraphicFramePr>
+              <a:graphicFrameLocks noChangeAspect="1"/>
+            </wp:cNvGraphicFramePr>
+            <a:graphic>
+              <a:graphicData uri="http://schemas.openxmlformats.org/drawingml/2006/picture">
+                <pic:pic>
+                  <pic:nvPicPr>
+                    <pic:cNvPr id="0" name="report_top20_products.png"/>
+                    <pic:cNvPicPr/>
+                  </pic:nvPicPr>
+                  <pic:blipFill>
+                    <a:blip r:embed="rId14"/>
+                    <a:stretch>
+                      <a:fillRect/>
+                    </a:stretch>
+                  </pic:blipFill>
+                  <pic:spPr>
+                    <a:xfrm>
+                      <a:off x="0" y="0"/>
+                      <a:ext cx="5400000" cy="4149817"/>
+                    </a:xfrm>
+                    <a:prstGeom prst="rect"/>
+                  </pic:spPr>
+                </pic:pic>
+              </a:graphicData>
+            </a:graphic>
+          </wp:inline>
+        </w:drawing>
+      </w:r>
+    </w:p>
+    <w:p>
+      <w:pPr>
+        <w:spacing w:after="200"/>
+        <w:jc w:val="center"/>
+      </w:pPr>
+      <w:r>
+        <w:rPr>
+          <w:b w:val="0"/>
+          <w:i/>
+          <w:color w:val="666666"/>
+          <w:sz w:val="17"/>
+        </w:rPr>
+        <w:t>Fig 4b. Top-20 SKUs by demand — note several high-demand items still WMS-classed C.</w:t>
       </w:r>
     </w:p>
     <w:p>
@@ -3244,8 +3383,8 @@
       <w:r>
         <w:drawing>
           <wp:inline xmlns:a="http://schemas.openxmlformats.org/drawingml/2006/main" xmlns:pic="http://schemas.openxmlformats.org/drawingml/2006/picture">
-            <wp:extent cx="5400000" cy="2512628"/>
-            <wp:docPr id="5" name="Picture 5"/>
+            <wp:extent cx="5400000" cy="2546698"/>
+            <wp:docPr id="7" name="Picture 7"/>
             <wp:cNvGraphicFramePr>
               <a:graphicFrameLocks noChangeAspect="1"/>
             </wp:cNvGraphicFramePr>
@@ -3257,7 +3396,7 @@
                     <pic:cNvPicPr/>
                   </pic:nvPicPr>
                   <pic:blipFill>
-                    <a:blip r:embed="rId13"/>
+                    <a:blip r:embed="rId15"/>
                     <a:stretch>
                       <a:fillRect/>
                     </a:stretch>
@@ -3265,7 +3404,7 @@
                   <pic:spPr>
                     <a:xfrm>
                       <a:off x="0" y="0"/>
-                      <a:ext cx="5400000" cy="2512628"/>
+                      <a:ext cx="5400000" cy="2546698"/>
                     </a:xfrm>
                     <a:prstGeom prst="rect"/>
                   </pic:spPr>
@@ -3298,8 +3437,8 @@
       <w:r>
         <w:drawing>
           <wp:inline xmlns:a="http://schemas.openxmlformats.org/drawingml/2006/main" xmlns:pic="http://schemas.openxmlformats.org/drawingml/2006/picture">
-            <wp:extent cx="4680000" cy="2668095"/>
-            <wp:docPr id="6" name="Picture 6"/>
+            <wp:extent cx="4680000" cy="2667164"/>
+            <wp:docPr id="8" name="Picture 8"/>
             <wp:cNvGraphicFramePr>
               <a:graphicFrameLocks noChangeAspect="1"/>
             </wp:cNvGraphicFramePr>
@@ -3311,7 +3450,7 @@
                     <pic:cNvPicPr/>
                   </pic:nvPicPr>
                   <pic:blipFill>
-                    <a:blip r:embed="rId14"/>
+                    <a:blip r:embed="rId16"/>
                     <a:stretch>
                       <a:fillRect/>
                     </a:stretch>
@@ -3319,7 +3458,7 @@
                   <pic:spPr>
                     <a:xfrm>
                       <a:off x="0" y="0"/>
-                      <a:ext cx="4680000" cy="2668095"/>
+                      <a:ext cx="4680000" cy="2667164"/>
                     </a:xfrm>
                     <a:prstGeom prst="rect"/>
                   </pic:spPr>
@@ -4336,8 +4475,8 @@
       <w:r>
         <w:drawing>
           <wp:inline xmlns:a="http://schemas.openxmlformats.org/drawingml/2006/main" xmlns:pic="http://schemas.openxmlformats.org/drawingml/2006/picture">
-            <wp:extent cx="5040000" cy="2705954"/>
-            <wp:docPr id="7" name="Picture 7"/>
+            <wp:extent cx="5040000" cy="2704865"/>
+            <wp:docPr id="9" name="Picture 9"/>
             <wp:cNvGraphicFramePr>
               <a:graphicFrameLocks noChangeAspect="1"/>
             </wp:cNvGraphicFramePr>
@@ -4349,7 +4488,7 @@
                     <pic:cNvPicPr/>
                   </pic:nvPicPr>
                   <pic:blipFill>
-                    <a:blip r:embed="rId15"/>
+                    <a:blip r:embed="rId17"/>
                     <a:stretch>
                       <a:fillRect/>
                     </a:stretch>
@@ -4357,7 +4496,7 @@
                   <pic:spPr>
                     <a:xfrm>
                       <a:off x="0" y="0"/>
-                      <a:ext cx="5040000" cy="2705954"/>
+                      <a:ext cx="5040000" cy="2704865"/>
                     </a:xfrm>
                     <a:prstGeom prst="rect"/>
                   </pic:spPr>
@@ -5280,8 +5419,8 @@
       <w:r>
         <w:drawing>
           <wp:inline xmlns:a="http://schemas.openxmlformats.org/drawingml/2006/main" xmlns:pic="http://schemas.openxmlformats.org/drawingml/2006/picture">
-            <wp:extent cx="4320000" cy="2371873"/>
-            <wp:docPr id="8" name="Picture 8"/>
+            <wp:extent cx="4320000" cy="2439261"/>
+            <wp:docPr id="10" name="Picture 10"/>
             <wp:cNvGraphicFramePr>
               <a:graphicFrameLocks noChangeAspect="1"/>
             </wp:cNvGraphicFramePr>
@@ -5293,7 +5432,7 @@
                     <pic:cNvPicPr/>
                   </pic:nvPicPr>
                   <pic:blipFill>
-                    <a:blip r:embed="rId16"/>
+                    <a:blip r:embed="rId18"/>
                     <a:stretch>
                       <a:fillRect/>
                     </a:stretch>
@@ -5301,7 +5440,7 @@
                   <pic:spPr>
                     <a:xfrm>
                       <a:off x="0" y="0"/>
-                      <a:ext cx="4320000" cy="2371873"/>
+                      <a:ext cx="4320000" cy="2439261"/>
                     </a:xfrm>
                     <a:prstGeom prst="rect"/>
                   </pic:spPr>
@@ -5400,6 +5539,74 @@
           <w:sz w:val="21"/>
         </w:rPr>
         <w:t xml:space="preserve"> confirm the 7,000 m² scope (A008); obtain labour/equipment costs (A006) to confirm B vs C in the financial model; validate double-deep against the EURO/K3/XLONG pallet mix.</w:t>
+      </w:r>
+    </w:p>
+    <w:p>
+      <w:pPr>
+        <w:spacing w:after="80"/>
+      </w:pPr>
+      <w:r>
+        <w:rPr>
+          <w:b w:val="0"/>
+          <w:i/>
+          <w:color w:val="666666"/>
+          <w:sz w:val="19"/>
+        </w:rPr>
+        <w:t>Recommended concept preview (detailed layout and 3D in Deliverable 2):</w:t>
+      </w:r>
+    </w:p>
+    <w:p>
+      <w:pPr>
+        <w:jc w:val="center"/>
+      </w:pPr>
+      <w:r>
+        <w:drawing>
+          <wp:inline xmlns:a="http://schemas.openxmlformats.org/drawingml/2006/main" xmlns:pic="http://schemas.openxmlformats.org/drawingml/2006/picture">
+            <wp:extent cx="5760000" cy="4949334"/>
+            <wp:docPr id="11" name="Picture 11"/>
+            <wp:cNvGraphicFramePr>
+              <a:graphicFrameLocks noChangeAspect="1"/>
+            </wp:cNvGraphicFramePr>
+            <a:graphic>
+              <a:graphicData uri="http://schemas.openxmlformats.org/drawingml/2006/picture">
+                <pic:pic>
+                  <pic:nvPicPr>
+                    <pic:cNvPr id="0" name="layout_floorplan.png"/>
+                    <pic:cNvPicPr/>
+                  </pic:nvPicPr>
+                  <pic:blipFill>
+                    <a:blip r:embed="rId19"/>
+                    <a:stretch>
+                      <a:fillRect/>
+                    </a:stretch>
+                  </pic:blipFill>
+                  <pic:spPr>
+                    <a:xfrm>
+                      <a:off x="0" y="0"/>
+                      <a:ext cx="5760000" cy="4949334"/>
+                    </a:xfrm>
+                    <a:prstGeom prst="rect"/>
+                  </pic:spPr>
+                </pic:pic>
+              </a:graphicData>
+            </a:graphic>
+          </wp:inline>
+        </w:drawing>
+      </w:r>
+    </w:p>
+    <w:p>
+      <w:pPr>
+        <w:spacing w:after="200"/>
+        <w:jc w:val="center"/>
+      </w:pPr>
+      <w:r>
+        <w:rPr>
+          <w:b w:val="0"/>
+          <w:i/>
+          <w:color w:val="666666"/>
+          <w:sz w:val="17"/>
+        </w:rPr>
+        <w:t>Fig 9. Recommended Option B — warehouse floor plan (rack-level, to scale).</w:t>
       </w:r>
     </w:p>
     <w:p>
@@ -5870,6 +6077,53 @@
               <w:rPr>
                 <w:sz w:val="19"/>
               </w:rPr>
+              <w:t>A013</w:t>
+            </w:r>
+          </w:p>
+        </w:tc>
+        <w:tc>
+          <w:tcPr>
+            <w:tcW w:type="dxa" w:w="6520"/>
+          </w:tcPr>
+          <w:p>
+            <w:r/>
+            <w:r>
+              <w:rPr>
+                <w:sz w:val="19"/>
+              </w:rPr>
+              <w:t>Functional (non-storage) areas sized from actual order volume</w:t>
+            </w:r>
+          </w:p>
+        </w:tc>
+        <w:tc>
+          <w:tcPr>
+            <w:tcW w:type="dxa" w:w="1134"/>
+          </w:tcPr>
+          <w:p>
+            <w:pPr>
+              <w:jc w:val="right"/>
+            </w:pPr>
+            <w:r/>
+            <w:r>
+              <w:rPr>
+                <w:sz w:val="19"/>
+              </w:rPr>
+              <w:t>HIGH</w:t>
+            </w:r>
+          </w:p>
+        </w:tc>
+      </w:tr>
+      <w:tr>
+        <w:tc>
+          <w:tcPr>
+            <w:tcW w:type="dxa" w:w="850"/>
+          </w:tcPr>
+          <w:p>
+            <w:r/>
+            <w:r>
+              <w:rPr>
+                <w:sz w:val="19"/>
+              </w:rPr>
               <w:t>A014</w:t>
             </w:r>
           </w:p>
@@ -5885,6 +6139,53 @@
                 <w:sz w:val="19"/>
               </w:rPr>
               <w:t>Labour productivity benchmarks (units/person-hour)</w:t>
+            </w:r>
+          </w:p>
+        </w:tc>
+        <w:tc>
+          <w:tcPr>
+            <w:tcW w:type="dxa" w:w="1134"/>
+          </w:tcPr>
+          <w:p>
+            <w:pPr>
+              <w:jc w:val="right"/>
+            </w:pPr>
+            <w:r/>
+            <w:r>
+              <w:rPr>
+                <w:sz w:val="19"/>
+              </w:rPr>
+              <w:t>HIGH</w:t>
+            </w:r>
+          </w:p>
+        </w:tc>
+      </w:tr>
+      <w:tr>
+        <w:tc>
+          <w:tcPr>
+            <w:tcW w:type="dxa" w:w="850"/>
+          </w:tcPr>
+          <w:p>
+            <w:r/>
+            <w:r>
+              <w:rPr>
+                <w:sz w:val="19"/>
+              </w:rPr>
+              <w:t>A017</w:t>
+            </w:r>
+          </w:p>
+        </w:tc>
+        <w:tc>
+          <w:tcPr>
+            <w:tcW w:type="dxa" w:w="6520"/>
+          </w:tcPr>
+          <w:p>
+            <w:r/>
+            <w:r>
+              <w:rPr>
+                <w:sz w:val="19"/>
+              </w:rPr>
+              <w:t>Peak-aware slotting: spread fast movers, duplicate extreme SKUs, balance picks/aisle on peak forecast</w:t>
             </w:r>
           </w:p>
         </w:tc>
@@ -5927,7 +6228,7 @@
       </w:r>
     </w:p>
     <w:sectPr>
-      <w:footerReference w:type="default" r:id="rId17"/>
+      <w:footerReference w:type="default" r:id="rId20"/>
       <w:pgSz w:w="12240" w:h="15840"/>
       <w:pgMar w:top="1440" w:right="1800" w:bottom="1440" w:left="1800" w:header="720" w:footer="720" w:gutter="0"/>
       <w:cols w:space="720"/>

</xml_diff>

<commit_message>
Fix corrupt .docx: wrap TOC field text in a run (bare w:t inside w:fldSimple was invalid Word XML)
Co-Authored-By: Claude Opus 4.8 <noreply@anthropic.com>
</commit_message>
<xml_diff>
--- a/deliverables/Deliverable_1_Analysis.docx
+++ b/deliverables/Deliverable_1_Analysis.docx
@@ -361,21 +361,10 @@
     </w:p>
     <w:p>
       <w:fldSimple w:instr="TOC \o &quot;1-2&quot; \h \z \u">
-        <w:t>(In Word: right-click → Update Field to build the table of contents.)</w:t>
+        <w:r>
+          <w:t>(In Word: right-click → Update Field to build the table of contents.)</w:t>
+        </w:r>
       </w:fldSimple>
-    </w:p>
-    <w:p>
-      <w:pPr>
-        <w:spacing w:after="40"/>
-      </w:pPr>
-      <w:r>
-        <w:rPr>
-          <w:b w:val="0"/>
-          <w:i w:val="0"/>
-          <w:color w:val="222222"/>
-          <w:sz w:val="21"/>
-        </w:rPr>
-      </w:r>
     </w:p>
     <w:p>
       <w:r>

</xml_diff>

<commit_message>
Teacher feedback: inbound (loose containers), dock-door calc, Jungheinrich MHE, 08:00 release
Order-derived pick type; corrected storage basis (8,512 peak / 9,500 target); docks 3 in (west) + 5 out (east); fleet ETV 216i x3, ECE 225 x4, ERE 225 x2; D1, D2, deck, renders and registers aligned.

Co-Authored-By: Claude Opus 5.5 <noreply@anthropic.com>
</commit_message>
<xml_diff>
--- a/deliverables/Deliverable_1_Analysis.docx
+++ b/deliverables/Deliverable_1_Analysis.docx
@@ -321,7 +321,7 @@
               <w:rPr>
                 <w:sz w:val="19"/>
               </w:rPr>
-              <w:t>DRAFT — analysis, design options, policies &amp; recommendation</w:t>
+              <w:t>v2 — analysis, design options, policies &amp; recommendation (updated with teacher feedback)</w:t>
             </w:r>
           </w:p>
         </w:tc>
@@ -1302,21 +1302,21 @@
           <w:b w:val="0"/>
           <w:sz w:val="21"/>
         </w:rPr>
-        <w:t xml:space="preserve">Loads (≈ pallet positions) grew </w:t>
+        <w:t xml:space="preserve">Occupied locations (pallet positions) grew </w:t>
       </w:r>
       <w:r>
         <w:rPr>
           <w:b/>
           <w:sz w:val="21"/>
         </w:rPr>
-        <w:t>+8.2% in one quarter</w:t>
+        <w:t>7,715 → 8,512</w:t>
       </w:r>
       <w:r>
         <w:rPr>
           <w:b w:val="0"/>
           <w:sz w:val="21"/>
         </w:rPr>
-        <w:t xml:space="preserve"> (10,176 → 11,015); cube +15%.</w:t>
+        <w:t xml:space="preserve"> over the quarter; loads grew +8.2% (10,176 → 11,015); cube +15%.</w:t>
       </w:r>
     </w:p>
     <w:p>
@@ -1334,14 +1334,14 @@
           <w:b/>
           <w:sz w:val="21"/>
         </w:rPr>
-        <w:t>Peak concurrent loads = 11,015</w:t>
+        <w:t>Peak pallet positions ≈ 8,512 occupied locations</w:t>
       </w:r>
       <w:r>
         <w:rPr>
           <w:b w:val="0"/>
           <w:sz w:val="21"/>
         </w:rPr>
-        <w:t xml:space="preserve"> → baseline storage-position requirement (before growth buffer and honeycombing losses).</w:t>
+        <w:t xml:space="preserve"> → the storage baseline. The 11,015 loads sit in those locations (some locations hold more than one load), so loads overstate the positions needed (A004).</w:t>
       </w:r>
     </w:p>
     <w:p>
@@ -1908,49 +1908,34 @@
           <w:b w:val="0"/>
           <w:sz w:val="21"/>
         </w:rPr>
-        <w:t xml:space="preserve">Pick-type split by lines: case/list </w:t>
       </w:r>
       <w:r>
         <w:rPr>
           <w:b/>
           <w:sz w:val="21"/>
         </w:rPr>
-        <w:t>60.8%</w:t>
+        <w:t>Pick type is derived from what the client ordered</w:t>
       </w:r>
       <w:r>
         <w:rPr>
           <w:b w:val="0"/>
           <w:sz w:val="21"/>
         </w:rPr>
-        <w:t xml:space="preserve">, each </w:t>
+        <w:t xml:space="preserve"> (A022) — each line's quantity is compared with the SKU's case and pallet quantity: </w:t>
       </w:r>
       <w:r>
         <w:rPr>
           <w:b/>
           <w:sz w:val="21"/>
         </w:rPr>
-        <w:t>16.0%</w:t>
+        <w:t>75% each-pick lines, 24% case lines, 1% full-pallet lines</w:t>
       </w:r>
       <w:r>
         <w:rPr>
           <w:b w:val="0"/>
           <w:sz w:val="21"/>
         </w:rPr>
-        <w:t xml:space="preserve">, full-pallet </w:t>
-      </w:r>
-      <w:r>
-        <w:rPr>
-          <w:b/>
-          <w:sz w:val="21"/>
-        </w:rPr>
-        <w:t>2.6%</w:t>
-      </w:r>
-      <w:r>
-        <w:rPr>
-          <w:b w:val="0"/>
-          <w:sz w:val="21"/>
-        </w:rPr>
-        <w:t>, unflagged/other 20.6% (see DQ flag).</w:t>
+        <w:t xml:space="preserve"> (by units: 61% case, 26% each, 13% pallet).</w:t>
       </w:r>
     </w:p>
     <w:p>
@@ -1962,34 +1947,20 @@
           <w:b w:val="0"/>
           <w:sz w:val="21"/>
         </w:rPr>
-        <w:t xml:space="preserve">Pick effort (lifts): case/list </w:t>
       </w:r>
       <w:r>
         <w:rPr>
           <w:b/>
           <w:sz w:val="21"/>
         </w:rPr>
-        <w:t>279,669</w:t>
+        <w:t>Picking is each-dominant by line count</w:t>
       </w:r>
       <w:r>
         <w:rPr>
           <w:b w:val="0"/>
           <w:sz w:val="21"/>
         </w:rPr>
-        <w:t xml:space="preserve"> vs each 30,165 vs pallet 27,801 → </w:t>
-      </w:r>
-      <w:r>
-        <w:rPr>
-          <w:b/>
-          <w:sz w:val="21"/>
-        </w:rPr>
-        <w:t>case picking is the dominant labour driver (~83% of lifts).</w:t>
-      </w:r>
-      <w:r>
-        <w:rPr>
-          <w:b w:val="0"/>
-          <w:sz w:val="21"/>
-        </w:rPr>
+        <w:t xml:space="preserve"> (the labour driver) and case-dominant by volume. DHL's historical pick flags (case/list 60.8%, each 16.0%, 20.6% unflagged) reflect past practice and are not used for design.</w:t>
       </w:r>
     </w:p>
     <w:p>
@@ -2047,7 +2018,7 @@
       <w:r>
         <w:drawing>
           <wp:inline xmlns:a="http://schemas.openxmlformats.org/drawingml/2006/main" xmlns:pic="http://schemas.openxmlformats.org/drawingml/2006/picture">
-            <wp:extent cx="3960000" cy="2668411"/>
+            <wp:extent cx="4680000" cy="2067160"/>
             <wp:docPr id="4" name="Picture 4"/>
             <wp:cNvGraphicFramePr>
               <a:graphicFrameLocks noChangeAspect="1"/>
@@ -2056,7 +2027,7 @@
               <a:graphicData uri="http://schemas.openxmlformats.org/drawingml/2006/picture">
                 <pic:pic>
                   <pic:nvPicPr>
-                    <pic:cNvPr id="0" name="order_pick_class.png"/>
+                    <pic:cNvPr id="0" name="order_pick_type_derived.png"/>
                     <pic:cNvPicPr/>
                   </pic:nvPicPr>
                   <pic:blipFill>
@@ -2068,7 +2039,7 @@
                   <pic:spPr>
                     <a:xfrm>
                       <a:off x="0" y="0"/>
-                      <a:ext cx="3960000" cy="2668411"/>
+                      <a:ext cx="4680000" cy="2067160"/>
                     </a:xfrm>
                     <a:prstGeom prst="rect"/>
                   </pic:spPr>
@@ -2091,7 +2062,7 @@
           <w:color w:val="666666"/>
           <w:sz w:val="17"/>
         </w:rPr>
-        <w:t>Fig 3. Order lines by pick type.</w:t>
+        <w:t>Fig 3. Pick type derived from the orders (line quantity vs case / pallet quantity).</w:t>
       </w:r>
     </w:p>
     <w:p>
@@ -3348,21 +3319,20 @@
           <w:b w:val="0"/>
           <w:sz w:val="21"/>
         </w:rPr>
-        <w:t xml:space="preserve">Intraday peak around </w:t>
       </w:r>
       <w:r>
         <w:rPr>
           <w:b/>
           <w:sz w:val="21"/>
         </w:rPr>
-        <w:t>08:00</w:t>
+        <w:t>The 08:00 intraday peak is caused by the order-release routine, not by customers</w:t>
       </w:r>
       <w:r>
         <w:rPr>
           <w:b w:val="0"/>
           <w:sz w:val="21"/>
         </w:rPr>
-        <w:t>; Monday–Friday only (no weekend operations), weekdays fairly even.</w:t>
+        <w:t xml:space="preserve"> (A023): 55% of orders arrive 15:00–17:00, are released 16:00–18:00 and are picked the next morning, so the backlog hits the floor at shift start (1.31× the average hour). Monday–Friday only, weekdays fairly even.</w:t>
       </w:r>
     </w:p>
     <w:p>
@@ -3426,7 +3396,7 @@
       <w:r>
         <w:drawing>
           <wp:inline xmlns:a="http://schemas.openxmlformats.org/drawingml/2006/main" xmlns:pic="http://schemas.openxmlformats.org/drawingml/2006/picture">
-            <wp:extent cx="4680000" cy="2667164"/>
+            <wp:extent cx="5400000" cy="2598791"/>
             <wp:docPr id="8" name="Picture 8"/>
             <wp:cNvGraphicFramePr>
               <a:graphicFrameLocks noChangeAspect="1"/>
@@ -3435,7 +3405,7 @@
               <a:graphicData uri="http://schemas.openxmlformats.org/drawingml/2006/picture">
                 <pic:pic>
                   <pic:nvPicPr>
-                    <pic:cNvPr id="0" name="pick_hourly_profile.png"/>
+                    <pic:cNvPr id="0" name="order_release_profile.png"/>
                     <pic:cNvPicPr/>
                   </pic:nvPicPr>
                   <pic:blipFill>
@@ -3447,7 +3417,7 @@
                   <pic:spPr>
                     <a:xfrm>
                       <a:off x="0" y="0"/>
-                      <a:ext cx="4680000" cy="2667164"/>
+                      <a:ext cx="5400000" cy="2598791"/>
                     </a:xfrm>
                     <a:prstGeom prst="rect"/>
                   </pic:spPr>
@@ -3470,7 +3440,7 @@
           <w:color w:val="666666"/>
           <w:sz w:val="17"/>
         </w:rPr>
-        <w:t>Fig 6. Average picks per hour of day.</w:t>
+        <w:t>Fig 6. Order arrival vs release vs picking by hour — the 08:00 peak is the release backlog.</w:t>
       </w:r>
     </w:p>
     <w:p>
@@ -3567,7 +3537,7 @@
           <w:b w:val="0"/>
           <w:sz w:val="21"/>
         </w:rPr>
-        <w:t xml:space="preserve"> — no PALL/LIST/TROLLEY flag set; method needs a definition from DHL/WMS.</w:t>
+        <w:t xml:space="preserve"> — no PALL/LIST/TROLLEY flag set. Resolved for the design: the pick type is derived from order quantities instead of these flags (A022).</w:t>
       </w:r>
     </w:p>
     <w:p>
@@ -3625,7 +3595,7 @@
           <w:b w:val="0"/>
           <w:sz w:val="21"/>
         </w:rPr>
-        <w:t xml:space="preserve"> ~11,015 pallet positions today, growing ~+8.2%/quarter → target ≈ 12,000–13,000 positions incl. buffer, within the 12.2 m / 7,000 m² envelope (A008).</w:t>
+        <w:t xml:space="preserve"> ~8,512 pallet positions at peak → target ~9,500 (÷ 0.90 working utilisation); growth (+8%/quarter in loads) is absorbed by extra rack levels, not by an inflated count. Must fit the 12.2 m / 7,000 m² envelope (A008).</w:t>
       </w:r>
     </w:p>
     <w:p>
@@ -3668,14 +3638,14 @@
           <w:b/>
           <w:sz w:val="21"/>
         </w:rPr>
-        <w:t>Picking is case-dominant</w:t>
+        <w:t>Picking is each-dominant by lines</w:t>
       </w:r>
       <w:r>
         <w:rPr>
           <w:b w:val="0"/>
           <w:sz w:val="21"/>
         </w:rPr>
-        <w:t xml:space="preserve"> (~83% of lifts) with meaningful each (16% of lines) and minor full-pallet (2.6%) → mixed pick methods; case-pick productivity is the key labour lever.</w:t>
+        <w:t xml:space="preserve"> (75% each, 24% case, 1% full pallet — derived from the orders) and half of all orders are single-line → batch picking from an easy-reach fast-pick area is the key labour lever.</w:t>
       </w:r>
     </w:p>
     <w:p>
@@ -3725,7 +3695,7 @@
           <w:b w:val="0"/>
           <w:sz w:val="21"/>
         </w:rPr>
-        <w:t xml:space="preserve"> — 1171 lines / 63469 units on the peak day; ~08:00 intraday peak.</w:t>
+        <w:t xml:space="preserve"> — 1171 lines / 63469 units on the peak day; the 08:00 peak is a release effect that waves can level.</w:t>
       </w:r>
     </w:p>
     <w:p>
@@ -3747,7 +3717,25 @@
           <w:color w:val="222222"/>
           <w:sz w:val="21"/>
         </w:rPr>
-        <w:t>Design target: peak 11,015 concurrent loads × 1.15 growth/safety buffer ÷ 0.90 target utilisation = **~14,074 pallet positions**. Measured pallet+load height is low (p90 116 cm), giving a 1.41 m level pitch and up to 8 levels under 12.2 m.</w:t>
+        <w:t xml:space="preserve">Design target: peak </w:t>
+      </w:r>
+      <w:r>
+        <w:rPr>
+          <w:b/>
+          <w:i w:val="0"/>
+          <w:color w:val="222222"/>
+          <w:sz w:val="21"/>
+        </w:rPr>
+        <w:t>8,512 occupied locations ÷ 0.90 working utilisation ≈ 9,500 pallet positions</w:t>
+      </w:r>
+      <w:r>
+        <w:rPr>
+          <w:b w:val="0"/>
+          <w:i w:val="0"/>
+          <w:color w:val="222222"/>
+          <w:sz w:val="21"/>
+        </w:rPr>
+        <w:t xml:space="preserve"> (A010). This replaces the earlier 14,074 (loads × 1.15 buffer), which overstated the need by counting loads instead of positions. Measured pallet+load height is low (p90 116 cm), giving a 1.41 m level pitch and up to 8 levels under 12.2 m.</w:t>
       </w:r>
     </w:p>
     <w:p>
@@ -3933,7 +3921,7 @@
               <w:rPr>
                 <w:sz w:val="19"/>
               </w:rPr>
-              <w:t>10,085</w:t>
+              <w:t>6,810</w:t>
             </w:r>
           </w:p>
         </w:tc>
@@ -3950,7 +3938,7 @@
               <w:rPr>
                 <w:sz w:val="19"/>
               </w:rPr>
-              <w:t>144%</w:t>
+              <w:t>97%</w:t>
             </w:r>
           </w:p>
         </w:tc>
@@ -3967,7 +3955,7 @@
               <w:rPr>
                 <w:sz w:val="19"/>
               </w:rPr>
-              <w:t>TIGHT/NO</w:t>
+              <w:t>TIGHT</w:t>
             </w:r>
           </w:p>
         </w:tc>
@@ -4034,7 +4022,7 @@
               <w:rPr>
                 <w:sz w:val="19"/>
               </w:rPr>
-              <w:t>7,472</w:t>
+              <w:t>5,040</w:t>
             </w:r>
           </w:p>
         </w:tc>
@@ -4051,7 +4039,7 @@
               <w:rPr>
                 <w:sz w:val="19"/>
               </w:rPr>
-              <w:t>107%</w:t>
+              <w:t>72%</w:t>
             </w:r>
           </w:p>
         </w:tc>
@@ -4068,7 +4056,7 @@
               <w:rPr>
                 <w:sz w:val="19"/>
               </w:rPr>
-              <w:t>TIGHT/NO</w:t>
+              <w:t>YES</w:t>
             </w:r>
           </w:p>
         </w:tc>
@@ -4135,7 +4123,7 @@
               <w:rPr>
                 <w:sz w:val="19"/>
               </w:rPr>
-              <w:t>6,351</w:t>
+              <w:t>4,280</w:t>
             </w:r>
           </w:p>
         </w:tc>
@@ -4152,7 +4140,7 @@
               <w:rPr>
                 <w:sz w:val="19"/>
               </w:rPr>
-              <w:t>91%</w:t>
+              <w:t>61%</w:t>
             </w:r>
           </w:p>
         </w:tc>
@@ -4236,7 +4224,7 @@
               <w:rPr>
                 <w:sz w:val="19"/>
               </w:rPr>
-              <w:t>5,022</w:t>
+              <w:t>3,390</w:t>
             </w:r>
           </w:p>
         </w:tc>
@@ -4253,7 +4241,7 @@
               <w:rPr>
                 <w:sz w:val="19"/>
               </w:rPr>
-              <w:t>72%</w:t>
+              <w:t>48%</w:t>
             </w:r>
           </w:p>
         </w:tc>
@@ -4337,7 +4325,7 @@
               <w:rPr>
                 <w:sz w:val="19"/>
               </w:rPr>
-              <w:t>9,369</w:t>
+              <w:t>6,330</w:t>
             </w:r>
           </w:p>
         </w:tc>
@@ -4354,7 +4342,7 @@
               <w:rPr>
                 <w:sz w:val="19"/>
               </w:rPr>
-              <w:t>134%</w:t>
+              <w:t>90%</w:t>
             </w:r>
           </w:p>
         </w:tc>
@@ -4371,7 +4359,7 @@
               <w:rPr>
                 <w:sz w:val="19"/>
               </w:rPr>
-              <w:t>TIGHT/NO</w:t>
+              <w:t>TIGHT</w:t>
             </w:r>
           </w:p>
         </w:tc>
@@ -4411,39 +4399,14 @@
           <w:b/>
           <w:sz w:val="21"/>
         </w:rPr>
-        <w:t>Conventional wide-aisle racking does not fit</w:t>
+        <w:t>At the corrected target several concepts fit:</w:t>
       </w:r>
       <w:r>
         <w:rPr>
           <w:b w:val="0"/>
           <w:sz w:val="21"/>
         </w:rPr>
-        <w:t xml:space="preserve"> (144% of the envelope); drive-in is also too space-hungry given the many single-load SKUs.</w:t>
-      </w:r>
-    </w:p>
-    <w:p>
-      <w:pPr>
-        <w:pStyle w:val="ListBullet"/>
-      </w:pPr>
-      <w:r>
-        <w:rPr>
-          <w:b w:val="0"/>
-          <w:sz w:val="21"/>
-        </w:rPr>
-      </w:r>
-      <w:r>
-        <w:rPr>
-          <w:b/>
-          <w:sz w:val="21"/>
-        </w:rPr>
-        <w:t>Double-deep (91%) and VNA (72%) fit comfortably</w:t>
-      </w:r>
-      <w:r>
-        <w:rPr>
-          <w:b w:val="0"/>
-          <w:sz w:val="21"/>
-        </w:rPr>
-        <w:t>; narrow-aisle single-deep is borderline (107%).</w:t>
+        <w:t xml:space="preserve"> double-deep 61%, narrow-aisle selective 72%, VNA 48%. Wide-aisle (97%) and drive-in (90%) are tight.</w:t>
       </w:r>
     </w:p>
     <w:p>
@@ -4454,7 +4417,7 @@
         <w:rPr>
           <w:sz w:val="21"/>
         </w:rPr>
-        <w:t>→ Higher-density storage is required, not optional — this shapes the options below.</w:t>
+        <w:t>→ Space alone no longer decides the concept. The choice is driven by travel and labour, slotting flexibility, growth headroom and cost — compared in the options and decision matrix below.</w:t>
       </w:r>
     </w:p>
     <w:p>
@@ -4464,7 +4427,7 @@
       <w:r>
         <w:drawing>
           <wp:inline xmlns:a="http://schemas.openxmlformats.org/drawingml/2006/main" xmlns:pic="http://schemas.openxmlformats.org/drawingml/2006/picture">
-            <wp:extent cx="5040000" cy="2704865"/>
+            <wp:extent cx="5040000" cy="2339789"/>
             <wp:docPr id="9" name="Picture 9"/>
             <wp:cNvGraphicFramePr>
               <a:graphicFrameLocks noChangeAspect="1"/>
@@ -4473,7 +4436,7 @@
               <a:graphicData uri="http://schemas.openxmlformats.org/drawingml/2006/picture">
                 <pic:pic>
                   <pic:nvPicPr>
-                    <pic:cNvPr id="0" name="capacity_concepts.png"/>
+                    <pic:cNvPr id="0" name="capacity_feasibility_corrected.png"/>
                     <pic:cNvPicPr/>
                   </pic:nvPicPr>
                   <pic:blipFill>
@@ -4485,7 +4448,7 @@
                   <pic:spPr>
                     <a:xfrm>
                       <a:off x="0" y="0"/>
-                      <a:ext cx="5040000" cy="2704865"/>
+                      <a:ext cx="5040000" cy="2339789"/>
                     </a:xfrm>
                     <a:prstGeom prst="rect"/>
                   </pic:spPr>
@@ -4508,7 +4471,7 @@
           <w:color w:val="666666"/>
           <w:sz w:val="17"/>
         </w:rPr>
-        <w:t>Fig 7. Floor area to hold the position target, by concept, vs the 7,000 m² envelope.</w:t>
+        <w:t>Fig 7. Floor area to hold the corrected position target, by concept, vs the 7,000 m² envelope.</w:t>
       </w:r>
     </w:p>
     <w:p>
@@ -4563,7 +4526,7 @@
           <w:b w:val="0"/>
           <w:sz w:val="21"/>
         </w:rPr>
-        <w:t xml:space="preserve"> selective single-deep, narrow-aisle (reach), 7 levels; two-zone ABC. ~7,500 m² (borderline).</w:t>
+        <w:t xml:space="preserve"> selective single-deep, narrow-aisle (reach), 7 levels; two-zone ABC. ≈72% of the envelope.</w:t>
       </w:r>
     </w:p>
     <w:p>
@@ -4638,7 +4601,7 @@
           <w:b w:val="0"/>
           <w:sz w:val="21"/>
         </w:rPr>
-        <w:t xml:space="preserve"> cheapest and simplest, but only just fits, with the highest travel and labour.</w:t>
+        <w:t xml:space="preserve"> cheapest and simplest, but the most aisles, travel and labour.</w:t>
       </w:r>
     </w:p>
     <w:p>
@@ -4671,7 +4634,7 @@
           <w:b w:val="0"/>
           <w:sz w:val="21"/>
         </w:rPr>
-        <w:t xml:space="preserve"> double-deep reach racking for A/B reserve + selective single-deep for irregular SKUs + a forward-pick module (carton-flow / shelving) for fast case/each; cantilever for XLONG goods. ~6,000–6,400 m².</w:t>
+        <w:t xml:space="preserve"> double-deep reach racking for A/B reserve + selective single-deep for irregular SKUs + a forward-pick module (carton-flow / shelving) for fast case/each; cantilever for XLONG goods. ≈61% of the envelope for storage + working areas — room to grow.</w:t>
       </w:r>
     </w:p>
     <w:p>
@@ -4721,7 +4684,7 @@
           <w:b w:val="0"/>
           <w:sz w:val="21"/>
         </w:rPr>
-        <w:t xml:space="preserve"> deep-reach trucks, order pickers, pallet trucks, voice/RF, print-and-apply.</w:t>
+        <w:t xml:space="preserve"> reach trucks with telescopic forks (Jungheinrich ETV 216i), horizontal order pickers (ECE 225), rider pallet trucks (ERE 225), voice/RF, print-and-apply — sized in Deliverable 2.</w:t>
       </w:r>
     </w:p>
     <w:p>
@@ -4804,7 +4767,7 @@
           <w:b w:val="0"/>
           <w:sz w:val="21"/>
         </w:rPr>
-        <w:t xml:space="preserve"> VNA (man-up turret) for reserve + automated small-parts store (shuttle/AutoStore-style) for the large C each-pick tail. ~5,000 m².</w:t>
+        <w:t xml:space="preserve"> VNA (man-up turret) for reserve + automated small-parts store (shuttle/AutoStore-style) for the large C each-pick tail. ≈48% of the envelope (densest).</w:t>
       </w:r>
     </w:p>
     <w:p>
@@ -5502,7 +5465,7 @@
           <w:b w:val="0"/>
           <w:sz w:val="21"/>
         </w:rPr>
-        <w:t xml:space="preserve"> double-deep fits at 91% where wide-aisle (144%) does not; 83% of lifts are case picking and 50% of orders single-line → batch/zone picking is the biggest labour lever; 48.6% ABC mismatch → velocity slotting is a cheap, high-value win; 73% single-load tail → dense reserve + fast forward pick.</w:t>
+        <w:t xml:space="preserve"> double-deep holds the corrected target in ≈61% of the envelope, leaving growth room with fewer aisles than selective racking; 75% of order lines are each-picks and 50% of orders single-line → batch/zone picking from a fast-pick area is the biggest labour lever; 48.6% ABC mismatch → velocity slotting is a cheap, high-value win; 73% single-load tail → dense reserve.</w:t>
       </w:r>
     </w:p>
     <w:p>
@@ -5845,7 +5808,7 @@
               <w:rPr>
                 <w:sz w:val="19"/>
               </w:rPr>
-              <w:t>One LODNUM (load) occupies one pallet position</w:t>
+              <w:t>Storage requirement is based on OCCUPIED LOCATIONS (pallet positions), not loads</w:t>
             </w:r>
           </w:p>
         </w:tc>
@@ -6196,6 +6159,194 @@
           </w:p>
         </w:tc>
       </w:tr>
+      <w:tr>
+        <w:tc>
+          <w:tcPr>
+            <w:tcW w:type="dxa" w:w="850"/>
+          </w:tcPr>
+          <w:p>
+            <w:r/>
+            <w:r>
+              <w:rPr>
+                <w:sz w:val="19"/>
+              </w:rPr>
+              <w:t>A018</w:t>
+            </w:r>
+          </w:p>
+        </w:tc>
+        <w:tc>
+          <w:tcPr>
+            <w:tcW w:type="dxa" w:w="6520"/>
+          </w:tcPr>
+          <w:p>
+            <w:r/>
+            <w:r>
+              <w:rPr>
+                <w:sz w:val="19"/>
+              </w:rPr>
+              <w:t>Inbound arrives as 2 shipments per day, direct from Assa Abloy factories</w:t>
+            </w:r>
+          </w:p>
+        </w:tc>
+        <w:tc>
+          <w:tcPr>
+            <w:tcW w:type="dxa" w:w="1134"/>
+          </w:tcPr>
+          <w:p>
+            <w:pPr>
+              <w:jc w:val="right"/>
+            </w:pPr>
+            <w:r/>
+            <w:r>
+              <w:rPr>
+                <w:sz w:val="19"/>
+              </w:rPr>
+              <w:t>HIGH</w:t>
+            </w:r>
+          </w:p>
+        </w:tc>
+      </w:tr>
+      <w:tr>
+        <w:tc>
+          <w:tcPr>
+            <w:tcW w:type="dxa" w:w="850"/>
+          </w:tcPr>
+          <w:p>
+            <w:r/>
+            <w:r>
+              <w:rPr>
+                <w:sz w:val="19"/>
+              </w:rPr>
+              <w:t>A019</w:t>
+            </w:r>
+          </w:p>
+        </w:tc>
+        <w:tc>
+          <w:tcPr>
+            <w:tcW w:type="dxa" w:w="6520"/>
+          </w:tcPr>
+          <w:p>
+            <w:r/>
+            <w:r>
+              <w:rPr>
+                <w:sz w:val="19"/>
+              </w:rPr>
+              <w:t>Part of inbound arrives LOOSE (floor-loaded sea containers) and is de-stuffed and palletised by hand</w:t>
+            </w:r>
+          </w:p>
+        </w:tc>
+        <w:tc>
+          <w:tcPr>
+            <w:tcW w:type="dxa" w:w="1134"/>
+          </w:tcPr>
+          <w:p>
+            <w:pPr>
+              <w:jc w:val="right"/>
+            </w:pPr>
+            <w:r/>
+            <w:r>
+              <w:rPr>
+                <w:sz w:val="19"/>
+              </w:rPr>
+              <w:t>HIGH</w:t>
+            </w:r>
+          </w:p>
+        </w:tc>
+      </w:tr>
+      <w:tr>
+        <w:tc>
+          <w:tcPr>
+            <w:tcW w:type="dxa" w:w="850"/>
+          </w:tcPr>
+          <w:p>
+            <w:r/>
+            <w:r>
+              <w:rPr>
+                <w:sz w:val="19"/>
+              </w:rPr>
+              <w:t>A020</w:t>
+            </w:r>
+          </w:p>
+        </w:tc>
+        <w:tc>
+          <w:tcPr>
+            <w:tcW w:type="dxa" w:w="6520"/>
+          </w:tcPr>
+          <w:p>
+            <w:r/>
+            <w:r>
+              <w:rPr>
+                <w:sz w:val="19"/>
+              </w:rPr>
+              <w:t>Dock-door planning parameters</w:t>
+            </w:r>
+          </w:p>
+        </w:tc>
+        <w:tc>
+          <w:tcPr>
+            <w:tcW w:type="dxa" w:w="1134"/>
+          </w:tcPr>
+          <w:p>
+            <w:pPr>
+              <w:jc w:val="right"/>
+            </w:pPr>
+            <w:r/>
+            <w:r>
+              <w:rPr>
+                <w:sz w:val="19"/>
+              </w:rPr>
+              <w:t>HIGH</w:t>
+            </w:r>
+          </w:p>
+        </w:tc>
+      </w:tr>
+      <w:tr>
+        <w:tc>
+          <w:tcPr>
+            <w:tcW w:type="dxa" w:w="850"/>
+          </w:tcPr>
+          <w:p>
+            <w:r/>
+            <w:r>
+              <w:rPr>
+                <w:sz w:val="19"/>
+              </w:rPr>
+              <w:t>A022</w:t>
+            </w:r>
+          </w:p>
+        </w:tc>
+        <w:tc>
+          <w:tcPr>
+            <w:tcW w:type="dxa" w:w="6520"/>
+          </w:tcPr>
+          <w:p>
+            <w:r/>
+            <w:r>
+              <w:rPr>
+                <w:sz w:val="19"/>
+              </w:rPr>
+              <w:t>Pick type is derived from what the client ordered, not from DHL's historical pick flags</w:t>
+            </w:r>
+          </w:p>
+        </w:tc>
+        <w:tc>
+          <w:tcPr>
+            <w:tcW w:type="dxa" w:w="1134"/>
+          </w:tcPr>
+          <w:p>
+            <w:pPr>
+              <w:jc w:val="right"/>
+            </w:pPr>
+            <w:r/>
+            <w:r>
+              <w:rPr>
+                <w:sz w:val="19"/>
+              </w:rPr>
+              <w:t>HIGH</w:t>
+            </w:r>
+          </w:p>
+        </w:tc>
+      </w:tr>
     </w:tbl>
     <w:p>
       <w:pPr>
@@ -6213,7 +6364,7 @@
           <w:color w:val="666666"/>
           <w:sz w:val="18"/>
         </w:rPr>
-        <w:t>Sources: project brief (client/university) and the Assa Abloy data files. External benchmarks (productivity, equipment specs, costs, safety codes) will be added with citations as later phases use them.</w:t>
+        <w:t>Sources: project brief, the Assa Abloy data files, teacher/DHL feedback and external references (Gadeyne on peak slotting; Jungheinrich equipment data) — full list in documentation/sources.md.</w:t>
       </w:r>
     </w:p>
     <w:sectPr>
@@ -6239,7 +6390,7 @@
         <w:color w:val="666666"/>
         <w:sz w:val="16"/>
       </w:rPr>
-      <w:t xml:space="preserve">Project OTM — Assa Abloy @ DHL Bemmel  ·  Deliverable 1 (Analysis) DRAFT  ·  Page </w:t>
+      <w:t xml:space="preserve">Project OTM — Assa Abloy @ DHL Bemmel  ·  Deliverable 1 (Analysis)  ·  Page </w:t>
     </w:r>
     <w:fldSimple w:instr="PAGE"/>
   </w:p>

</xml_diff>

<commit_message>
Teacher feedback 7-10: picking matched to order volume, aisles open both ends, departure plan
Order segmentation from SKU cube (trolley batch picking vs EJE 120i pick-to-pallet), ECE 225 dropped, pick-time model, tugger evaluated; front/rear cross-aisles; carrier departure slots with backward waves; machinery justification + turning checks; container de-stuffing outsourced; D1, D2, deck, renders, registers updated.

Co-Authored-By: Claude Opus 5.5 <noreply@anthropic.com>
</commit_message>
<xml_diff>
--- a/deliverables/Deliverable_1_Analysis.docx
+++ b/deliverables/Deliverable_1_Analysis.docx
@@ -4684,7 +4684,7 @@
           <w:b w:val="0"/>
           <w:sz w:val="21"/>
         </w:rPr>
-        <w:t xml:space="preserve"> reach trucks with telescopic forks (Jungheinrich ETV 216i), horizontal order pickers (ECE 225), rider pallet trucks (ERE 225), voice/RF, print-and-apply — sized in Deliverable 2.</w:t>
+        <w:t xml:space="preserve"> reach trucks with telescopic forks (Jungheinrich ETV 216i), pick trolleys for small orders and walkie pallet trucks (EJE 120i) for large orders, rider pallet trucks (ERE 225) at the docks, voice/RF, print-and-apply — sized in Deliverable 2.</w:t>
       </w:r>
     </w:p>
     <w:p>
@@ -6347,6 +6347,100 @@
           </w:p>
         </w:tc>
       </w:tr>
+      <w:tr>
+        <w:tc>
+          <w:tcPr>
+            <w:tcW w:type="dxa" w:w="850"/>
+          </w:tcPr>
+          <w:p>
+            <w:r/>
+            <w:r>
+              <w:rPr>
+                <w:sz w:val="19"/>
+              </w:rPr>
+              <w:t>A024</w:t>
+            </w:r>
+          </w:p>
+        </w:tc>
+        <w:tc>
+          <w:tcPr>
+            <w:tcW w:type="dxa" w:w="6520"/>
+          </w:tcPr>
+          <w:p>
+            <w:r/>
+            <w:r>
+              <w:rPr>
+                <w:sz w:val="19"/>
+              </w:rPr>
+              <w:t>Picking is split by ORDER SIZE computed from SKU each-dimensions and weights</w:t>
+            </w:r>
+          </w:p>
+        </w:tc>
+        <w:tc>
+          <w:tcPr>
+            <w:tcW w:type="dxa" w:w="1134"/>
+          </w:tcPr>
+          <w:p>
+            <w:pPr>
+              <w:jc w:val="right"/>
+            </w:pPr>
+            <w:r/>
+            <w:r>
+              <w:rPr>
+                <w:sz w:val="19"/>
+              </w:rPr>
+              <w:t>HIGH</w:t>
+            </w:r>
+          </w:p>
+        </w:tc>
+      </w:tr>
+      <w:tr>
+        <w:tc>
+          <w:tcPr>
+            <w:tcW w:type="dxa" w:w="850"/>
+          </w:tcPr>
+          <w:p>
+            <w:r/>
+            <w:r>
+              <w:rPr>
+                <w:sz w:val="19"/>
+              </w:rPr>
+              <w:t>A025</w:t>
+            </w:r>
+          </w:p>
+        </w:tc>
+        <w:tc>
+          <w:tcPr>
+            <w:tcW w:type="dxa" w:w="6520"/>
+          </w:tcPr>
+          <w:p>
+            <w:r/>
+            <w:r>
+              <w:rPr>
+                <w:sz w:val="19"/>
+              </w:rPr>
+              <w:t>Pick-time model parameters</w:t>
+            </w:r>
+          </w:p>
+        </w:tc>
+        <w:tc>
+          <w:tcPr>
+            <w:tcW w:type="dxa" w:w="1134"/>
+          </w:tcPr>
+          <w:p>
+            <w:pPr>
+              <w:jc w:val="right"/>
+            </w:pPr>
+            <w:r/>
+            <w:r>
+              <w:rPr>
+                <w:sz w:val="19"/>
+              </w:rPr>
+              <w:t>HIGH</w:t>
+            </w:r>
+          </w:p>
+        </w:tc>
+      </w:tr>
     </w:tbl>
     <w:p>
       <w:pPr>

</xml_diff>

<commit_message>
Align design with Week 3 lecture: concept evaluation, COI slotting, routing policies, KPIs
U-shaped vs flow-through evaluated on travel distance (flow-through kept); COI + family affinity slotting; S-shape/return/midpoint/largest-gap compared (largest gap used); rack/aisle W3 questions; legal aspects (EN 15512/15635, PGS 15 open question); data-handling hardware; W3 KPIs; W3 data checks + lead time per region in D1.

Co-Authored-By: Claude Opus 5.5 <noreply@anthropic.com>
</commit_message>
<xml_diff>
--- a/deliverables/Deliverable_1_Analysis.docx
+++ b/deliverables/Deliverable_1_Analysis.docx
@@ -2063,6 +2063,1990 @@
           <w:sz w:val="17"/>
         </w:rPr>
         <w:t>Fig 3. Pick type derived from the orders (line quantity vs case / pallet quantity).</w:t>
+      </w:r>
+    </w:p>
+    <w:p>
+      <w:pPr>
+        <w:spacing w:after="80"/>
+      </w:pPr>
+      <w:r>
+        <w:rPr>
+          <w:b w:val="0"/>
+          <w:i w:val="0"/>
+          <w:color w:val="222222"/>
+          <w:sz w:val="21"/>
+        </w:rPr>
+        <w:t>Delivery lead time per region (order received → trailer dispatched), countries with ≥ 20 orders:</w:t>
+      </w:r>
+    </w:p>
+    <w:tbl>
+      <w:tblPr>
+        <w:tblStyle w:val="LightGrid-Accent1"/>
+        <w:tblW w:type="auto" w:w="0"/>
+        <w:jc w:val="center"/>
+        <w:tblLook w:firstColumn="1" w:firstRow="1" w:lastColumn="0" w:lastRow="0" w:noHBand="0" w:noVBand="1" w:val="04A0"/>
+      </w:tblPr>
+      <w:tblGrid>
+        <w:gridCol w:w="1440"/>
+        <w:gridCol w:w="1440"/>
+        <w:gridCol w:w="1440"/>
+        <w:gridCol w:w="1440"/>
+        <w:gridCol w:w="1440"/>
+        <w:gridCol w:w="1440"/>
+      </w:tblGrid>
+      <w:tr>
+        <w:tc>
+          <w:tcPr>
+            <w:tcW w:type="dxa" w:w="1474"/>
+          </w:tcPr>
+          <w:p>
+            <w:r/>
+            <w:r>
+              <w:rPr>
+                <w:b/>
+                <w:sz w:val="19"/>
+              </w:rPr>
+              <w:t>Country</w:t>
+            </w:r>
+          </w:p>
+        </w:tc>
+        <w:tc>
+          <w:tcPr>
+            <w:tcW w:type="dxa" w:w="1361"/>
+          </w:tcPr>
+          <w:p>
+            <w:r/>
+            <w:r>
+              <w:rPr>
+                <w:b/>
+                <w:sz w:val="19"/>
+              </w:rPr>
+              <w:t>Orders</w:t>
+            </w:r>
+          </w:p>
+        </w:tc>
+        <w:tc>
+          <w:tcPr>
+            <w:tcW w:type="dxa" w:w="1361"/>
+          </w:tcPr>
+          <w:p>
+            <w:r/>
+            <w:r>
+              <w:rPr>
+                <w:b/>
+                <w:sz w:val="19"/>
+              </w:rPr>
+              <w:t>Median h</w:t>
+            </w:r>
+          </w:p>
+        </w:tc>
+        <w:tc>
+          <w:tcPr>
+            <w:tcW w:type="dxa" w:w="1361"/>
+          </w:tcPr>
+          <w:p>
+            <w:r/>
+            <w:r>
+              <w:rPr>
+                <w:b/>
+                <w:sz w:val="19"/>
+              </w:rPr>
+              <w:t>Mean h</w:t>
+            </w:r>
+          </w:p>
+        </w:tc>
+        <w:tc>
+          <w:tcPr>
+            <w:tcW w:type="dxa" w:w="1361"/>
+          </w:tcPr>
+          <w:p>
+            <w:r/>
+            <w:r>
+              <w:rPr>
+                <w:b/>
+                <w:sz w:val="19"/>
+              </w:rPr>
+              <w:t>p90 h</w:t>
+            </w:r>
+          </w:p>
+        </w:tc>
+        <w:tc>
+          <w:tcPr>
+            <w:tcW w:type="dxa" w:w="1361"/>
+          </w:tcPr>
+          <w:p>
+            <w:r/>
+            <w:r>
+              <w:rPr>
+                <w:b/>
+                <w:sz w:val="19"/>
+              </w:rPr>
+              <w:t>≤ 48 h</w:t>
+            </w:r>
+          </w:p>
+        </w:tc>
+      </w:tr>
+      <w:tr>
+        <w:tc>
+          <w:tcPr>
+            <w:tcW w:type="dxa" w:w="1474"/>
+          </w:tcPr>
+          <w:p>
+            <w:r/>
+            <w:r>
+              <w:rPr>
+                <w:sz w:val="19"/>
+              </w:rPr>
+              <w:t>NLD</w:t>
+            </w:r>
+          </w:p>
+        </w:tc>
+        <w:tc>
+          <w:tcPr>
+            <w:tcW w:type="dxa" w:w="1361"/>
+          </w:tcPr>
+          <w:p>
+            <w:pPr>
+              <w:jc w:val="right"/>
+            </w:pPr>
+            <w:r/>
+            <w:r>
+              <w:rPr>
+                <w:sz w:val="19"/>
+              </w:rPr>
+              <w:t>5,115</w:t>
+            </w:r>
+          </w:p>
+        </w:tc>
+        <w:tc>
+          <w:tcPr>
+            <w:tcW w:type="dxa" w:w="1361"/>
+          </w:tcPr>
+          <w:p>
+            <w:pPr>
+              <w:jc w:val="right"/>
+            </w:pPr>
+            <w:r/>
+            <w:r>
+              <w:rPr>
+                <w:sz w:val="19"/>
+              </w:rPr>
+              <w:t>25</w:t>
+            </w:r>
+          </w:p>
+        </w:tc>
+        <w:tc>
+          <w:tcPr>
+            <w:tcW w:type="dxa" w:w="1361"/>
+          </w:tcPr>
+          <w:p>
+            <w:pPr>
+              <w:jc w:val="right"/>
+            </w:pPr>
+            <w:r/>
+            <w:r>
+              <w:rPr>
+                <w:sz w:val="19"/>
+              </w:rPr>
+              <w:t>39</w:t>
+            </w:r>
+          </w:p>
+        </w:tc>
+        <w:tc>
+          <w:tcPr>
+            <w:tcW w:type="dxa" w:w="1361"/>
+          </w:tcPr>
+          <w:p>
+            <w:pPr>
+              <w:jc w:val="right"/>
+            </w:pPr>
+            <w:r/>
+            <w:r>
+              <w:rPr>
+                <w:sz w:val="19"/>
+              </w:rPr>
+              <w:t>98</w:t>
+            </w:r>
+          </w:p>
+        </w:tc>
+        <w:tc>
+          <w:tcPr>
+            <w:tcW w:type="dxa" w:w="1361"/>
+          </w:tcPr>
+          <w:p>
+            <w:pPr>
+              <w:jc w:val="right"/>
+            </w:pPr>
+            <w:r/>
+            <w:r>
+              <w:rPr>
+                <w:sz w:val="19"/>
+              </w:rPr>
+              <w:t>71%</w:t>
+            </w:r>
+          </w:p>
+        </w:tc>
+      </w:tr>
+      <w:tr>
+        <w:tc>
+          <w:tcPr>
+            <w:tcW w:type="dxa" w:w="1474"/>
+          </w:tcPr>
+          <w:p>
+            <w:r/>
+            <w:r>
+              <w:rPr>
+                <w:sz w:val="19"/>
+              </w:rPr>
+              <w:t>BEL</w:t>
+            </w:r>
+          </w:p>
+        </w:tc>
+        <w:tc>
+          <w:tcPr>
+            <w:tcW w:type="dxa" w:w="1361"/>
+          </w:tcPr>
+          <w:p>
+            <w:pPr>
+              <w:jc w:val="right"/>
+            </w:pPr>
+            <w:r/>
+            <w:r>
+              <w:rPr>
+                <w:sz w:val="19"/>
+              </w:rPr>
+              <w:t>1,707</w:t>
+            </w:r>
+          </w:p>
+        </w:tc>
+        <w:tc>
+          <w:tcPr>
+            <w:tcW w:type="dxa" w:w="1361"/>
+          </w:tcPr>
+          <w:p>
+            <w:pPr>
+              <w:jc w:val="right"/>
+            </w:pPr>
+            <w:r/>
+            <w:r>
+              <w:rPr>
+                <w:sz w:val="19"/>
+              </w:rPr>
+              <w:t>25</w:t>
+            </w:r>
+          </w:p>
+        </w:tc>
+        <w:tc>
+          <w:tcPr>
+            <w:tcW w:type="dxa" w:w="1361"/>
+          </w:tcPr>
+          <w:p>
+            <w:pPr>
+              <w:jc w:val="right"/>
+            </w:pPr>
+            <w:r/>
+            <w:r>
+              <w:rPr>
+                <w:sz w:val="19"/>
+              </w:rPr>
+              <w:t>38</w:t>
+            </w:r>
+          </w:p>
+        </w:tc>
+        <w:tc>
+          <w:tcPr>
+            <w:tcW w:type="dxa" w:w="1361"/>
+          </w:tcPr>
+          <w:p>
+            <w:pPr>
+              <w:jc w:val="right"/>
+            </w:pPr>
+            <w:r/>
+            <w:r>
+              <w:rPr>
+                <w:sz w:val="19"/>
+              </w:rPr>
+              <w:t>84</w:t>
+            </w:r>
+          </w:p>
+        </w:tc>
+        <w:tc>
+          <w:tcPr>
+            <w:tcW w:type="dxa" w:w="1361"/>
+          </w:tcPr>
+          <w:p>
+            <w:pPr>
+              <w:jc w:val="right"/>
+            </w:pPr>
+            <w:r/>
+            <w:r>
+              <w:rPr>
+                <w:sz w:val="19"/>
+              </w:rPr>
+              <w:t>74%</w:t>
+            </w:r>
+          </w:p>
+        </w:tc>
+      </w:tr>
+      <w:tr>
+        <w:tc>
+          <w:tcPr>
+            <w:tcW w:type="dxa" w:w="1474"/>
+          </w:tcPr>
+          <w:p>
+            <w:r/>
+            <w:r>
+              <w:rPr>
+                <w:sz w:val="19"/>
+              </w:rPr>
+              <w:t>DEU</w:t>
+            </w:r>
+          </w:p>
+        </w:tc>
+        <w:tc>
+          <w:tcPr>
+            <w:tcW w:type="dxa" w:w="1361"/>
+          </w:tcPr>
+          <w:p>
+            <w:pPr>
+              <w:jc w:val="right"/>
+            </w:pPr>
+            <w:r/>
+            <w:r>
+              <w:rPr>
+                <w:sz w:val="19"/>
+              </w:rPr>
+              <w:t>793</w:t>
+            </w:r>
+          </w:p>
+        </w:tc>
+        <w:tc>
+          <w:tcPr>
+            <w:tcW w:type="dxa" w:w="1361"/>
+          </w:tcPr>
+          <w:p>
+            <w:pPr>
+              <w:jc w:val="right"/>
+            </w:pPr>
+            <w:r/>
+            <w:r>
+              <w:rPr>
+                <w:sz w:val="19"/>
+              </w:rPr>
+              <w:t>23</w:t>
+            </w:r>
+          </w:p>
+        </w:tc>
+        <w:tc>
+          <w:tcPr>
+            <w:tcW w:type="dxa" w:w="1361"/>
+          </w:tcPr>
+          <w:p>
+            <w:pPr>
+              <w:jc w:val="right"/>
+            </w:pPr>
+            <w:r/>
+            <w:r>
+              <w:rPr>
+                <w:sz w:val="19"/>
+              </w:rPr>
+              <w:t>56</w:t>
+            </w:r>
+          </w:p>
+        </w:tc>
+        <w:tc>
+          <w:tcPr>
+            <w:tcW w:type="dxa" w:w="1361"/>
+          </w:tcPr>
+          <w:p>
+            <w:pPr>
+              <w:jc w:val="right"/>
+            </w:pPr>
+            <w:r/>
+            <w:r>
+              <w:rPr>
+                <w:sz w:val="19"/>
+              </w:rPr>
+              <w:t>171</w:t>
+            </w:r>
+          </w:p>
+        </w:tc>
+        <w:tc>
+          <w:tcPr>
+            <w:tcW w:type="dxa" w:w="1361"/>
+          </w:tcPr>
+          <w:p>
+            <w:pPr>
+              <w:jc w:val="right"/>
+            </w:pPr>
+            <w:r/>
+            <w:r>
+              <w:rPr>
+                <w:sz w:val="19"/>
+              </w:rPr>
+              <w:t>70%</w:t>
+            </w:r>
+          </w:p>
+        </w:tc>
+      </w:tr>
+      <w:tr>
+        <w:tc>
+          <w:tcPr>
+            <w:tcW w:type="dxa" w:w="1474"/>
+          </w:tcPr>
+          <w:p>
+            <w:r/>
+            <w:r>
+              <w:rPr>
+                <w:sz w:val="19"/>
+              </w:rPr>
+              <w:t>FRA</w:t>
+            </w:r>
+          </w:p>
+        </w:tc>
+        <w:tc>
+          <w:tcPr>
+            <w:tcW w:type="dxa" w:w="1361"/>
+          </w:tcPr>
+          <w:p>
+            <w:pPr>
+              <w:jc w:val="right"/>
+            </w:pPr>
+            <w:r/>
+            <w:r>
+              <w:rPr>
+                <w:sz w:val="19"/>
+              </w:rPr>
+              <w:t>381</w:t>
+            </w:r>
+          </w:p>
+        </w:tc>
+        <w:tc>
+          <w:tcPr>
+            <w:tcW w:type="dxa" w:w="1361"/>
+          </w:tcPr>
+          <w:p>
+            <w:pPr>
+              <w:jc w:val="right"/>
+            </w:pPr>
+            <w:r/>
+            <w:r>
+              <w:rPr>
+                <w:sz w:val="19"/>
+              </w:rPr>
+              <w:t>8</w:t>
+            </w:r>
+          </w:p>
+        </w:tc>
+        <w:tc>
+          <w:tcPr>
+            <w:tcW w:type="dxa" w:w="1361"/>
+          </w:tcPr>
+          <w:p>
+            <w:pPr>
+              <w:jc w:val="right"/>
+            </w:pPr>
+            <w:r/>
+            <w:r>
+              <w:rPr>
+                <w:sz w:val="19"/>
+              </w:rPr>
+              <w:t>32</w:t>
+            </w:r>
+          </w:p>
+        </w:tc>
+        <w:tc>
+          <w:tcPr>
+            <w:tcW w:type="dxa" w:w="1361"/>
+          </w:tcPr>
+          <w:p>
+            <w:pPr>
+              <w:jc w:val="right"/>
+            </w:pPr>
+            <w:r/>
+            <w:r>
+              <w:rPr>
+                <w:sz w:val="19"/>
+              </w:rPr>
+              <w:t>117</w:t>
+            </w:r>
+          </w:p>
+        </w:tc>
+        <w:tc>
+          <w:tcPr>
+            <w:tcW w:type="dxa" w:w="1361"/>
+          </w:tcPr>
+          <w:p>
+            <w:pPr>
+              <w:jc w:val="right"/>
+            </w:pPr>
+            <w:r/>
+            <w:r>
+              <w:rPr>
+                <w:sz w:val="19"/>
+              </w:rPr>
+              <w:t>81%</w:t>
+            </w:r>
+          </w:p>
+        </w:tc>
+      </w:tr>
+      <w:tr>
+        <w:tc>
+          <w:tcPr>
+            <w:tcW w:type="dxa" w:w="1474"/>
+          </w:tcPr>
+          <w:p>
+            <w:r/>
+            <w:r>
+              <w:rPr>
+                <w:sz w:val="19"/>
+              </w:rPr>
+              <w:t>CHE</w:t>
+            </w:r>
+          </w:p>
+        </w:tc>
+        <w:tc>
+          <w:tcPr>
+            <w:tcW w:type="dxa" w:w="1361"/>
+          </w:tcPr>
+          <w:p>
+            <w:pPr>
+              <w:jc w:val="right"/>
+            </w:pPr>
+            <w:r/>
+            <w:r>
+              <w:rPr>
+                <w:sz w:val="19"/>
+              </w:rPr>
+              <w:t>172</w:t>
+            </w:r>
+          </w:p>
+        </w:tc>
+        <w:tc>
+          <w:tcPr>
+            <w:tcW w:type="dxa" w:w="1361"/>
+          </w:tcPr>
+          <w:p>
+            <w:pPr>
+              <w:jc w:val="right"/>
+            </w:pPr>
+            <w:r/>
+            <w:r>
+              <w:rPr>
+                <w:sz w:val="19"/>
+              </w:rPr>
+              <w:t>140</w:t>
+            </w:r>
+          </w:p>
+        </w:tc>
+        <w:tc>
+          <w:tcPr>
+            <w:tcW w:type="dxa" w:w="1361"/>
+          </w:tcPr>
+          <w:p>
+            <w:pPr>
+              <w:jc w:val="right"/>
+            </w:pPr>
+            <w:r/>
+            <w:r>
+              <w:rPr>
+                <w:sz w:val="19"/>
+              </w:rPr>
+              <w:t>104</w:t>
+            </w:r>
+          </w:p>
+        </w:tc>
+        <w:tc>
+          <w:tcPr>
+            <w:tcW w:type="dxa" w:w="1361"/>
+          </w:tcPr>
+          <w:p>
+            <w:pPr>
+              <w:jc w:val="right"/>
+            </w:pPr>
+            <w:r/>
+            <w:r>
+              <w:rPr>
+                <w:sz w:val="19"/>
+              </w:rPr>
+              <w:t>166</w:t>
+            </w:r>
+          </w:p>
+        </w:tc>
+        <w:tc>
+          <w:tcPr>
+            <w:tcW w:type="dxa" w:w="1361"/>
+          </w:tcPr>
+          <w:p>
+            <w:pPr>
+              <w:jc w:val="right"/>
+            </w:pPr>
+            <w:r/>
+            <w:r>
+              <w:rPr>
+                <w:sz w:val="19"/>
+              </w:rPr>
+              <w:t>24%</w:t>
+            </w:r>
+          </w:p>
+        </w:tc>
+      </w:tr>
+      <w:tr>
+        <w:tc>
+          <w:tcPr>
+            <w:tcW w:type="dxa" w:w="1474"/>
+          </w:tcPr>
+          <w:p>
+            <w:r/>
+            <w:r>
+              <w:rPr>
+                <w:sz w:val="19"/>
+              </w:rPr>
+              <w:t>LUX</w:t>
+            </w:r>
+          </w:p>
+        </w:tc>
+        <w:tc>
+          <w:tcPr>
+            <w:tcW w:type="dxa" w:w="1361"/>
+          </w:tcPr>
+          <w:p>
+            <w:pPr>
+              <w:jc w:val="right"/>
+            </w:pPr>
+            <w:r/>
+            <w:r>
+              <w:rPr>
+                <w:sz w:val="19"/>
+              </w:rPr>
+              <w:t>112</w:t>
+            </w:r>
+          </w:p>
+        </w:tc>
+        <w:tc>
+          <w:tcPr>
+            <w:tcW w:type="dxa" w:w="1361"/>
+          </w:tcPr>
+          <w:p>
+            <w:pPr>
+              <w:jc w:val="right"/>
+            </w:pPr>
+            <w:r/>
+            <w:r>
+              <w:rPr>
+                <w:sz w:val="19"/>
+              </w:rPr>
+              <w:t>24</w:t>
+            </w:r>
+          </w:p>
+        </w:tc>
+        <w:tc>
+          <w:tcPr>
+            <w:tcW w:type="dxa" w:w="1361"/>
+          </w:tcPr>
+          <w:p>
+            <w:pPr>
+              <w:jc w:val="right"/>
+            </w:pPr>
+            <w:r/>
+            <w:r>
+              <w:rPr>
+                <w:sz w:val="19"/>
+              </w:rPr>
+              <w:t>31</w:t>
+            </w:r>
+          </w:p>
+        </w:tc>
+        <w:tc>
+          <w:tcPr>
+            <w:tcW w:type="dxa" w:w="1361"/>
+          </w:tcPr>
+          <w:p>
+            <w:pPr>
+              <w:jc w:val="right"/>
+            </w:pPr>
+            <w:r/>
+            <w:r>
+              <w:rPr>
+                <w:sz w:val="19"/>
+              </w:rPr>
+              <w:t>74</w:t>
+            </w:r>
+          </w:p>
+        </w:tc>
+        <w:tc>
+          <w:tcPr>
+            <w:tcW w:type="dxa" w:w="1361"/>
+          </w:tcPr>
+          <w:p>
+            <w:pPr>
+              <w:jc w:val="right"/>
+            </w:pPr>
+            <w:r/>
+            <w:r>
+              <w:rPr>
+                <w:sz w:val="19"/>
+              </w:rPr>
+              <w:t>81%</w:t>
+            </w:r>
+          </w:p>
+        </w:tc>
+      </w:tr>
+      <w:tr>
+        <w:tc>
+          <w:tcPr>
+            <w:tcW w:type="dxa" w:w="1474"/>
+          </w:tcPr>
+          <w:p>
+            <w:r/>
+            <w:r>
+              <w:rPr>
+                <w:sz w:val="19"/>
+              </w:rPr>
+              <w:t>POL</w:t>
+            </w:r>
+          </w:p>
+        </w:tc>
+        <w:tc>
+          <w:tcPr>
+            <w:tcW w:type="dxa" w:w="1361"/>
+          </w:tcPr>
+          <w:p>
+            <w:pPr>
+              <w:jc w:val="right"/>
+            </w:pPr>
+            <w:r/>
+            <w:r>
+              <w:rPr>
+                <w:sz w:val="19"/>
+              </w:rPr>
+              <w:t>57</w:t>
+            </w:r>
+          </w:p>
+        </w:tc>
+        <w:tc>
+          <w:tcPr>
+            <w:tcW w:type="dxa" w:w="1361"/>
+          </w:tcPr>
+          <w:p>
+            <w:pPr>
+              <w:jc w:val="right"/>
+            </w:pPr>
+            <w:r/>
+            <w:r>
+              <w:rPr>
+                <w:sz w:val="19"/>
+              </w:rPr>
+              <w:t>120</w:t>
+            </w:r>
+          </w:p>
+        </w:tc>
+        <w:tc>
+          <w:tcPr>
+            <w:tcW w:type="dxa" w:w="1361"/>
+          </w:tcPr>
+          <w:p>
+            <w:pPr>
+              <w:jc w:val="right"/>
+            </w:pPr>
+            <w:r/>
+            <w:r>
+              <w:rPr>
+                <w:sz w:val="19"/>
+              </w:rPr>
+              <w:t>129</w:t>
+            </w:r>
+          </w:p>
+        </w:tc>
+        <w:tc>
+          <w:tcPr>
+            <w:tcW w:type="dxa" w:w="1361"/>
+          </w:tcPr>
+          <w:p>
+            <w:pPr>
+              <w:jc w:val="right"/>
+            </w:pPr>
+            <w:r/>
+            <w:r>
+              <w:rPr>
+                <w:sz w:val="19"/>
+              </w:rPr>
+              <w:t>204</w:t>
+            </w:r>
+          </w:p>
+        </w:tc>
+        <w:tc>
+          <w:tcPr>
+            <w:tcW w:type="dxa" w:w="1361"/>
+          </w:tcPr>
+          <w:p>
+            <w:pPr>
+              <w:jc w:val="right"/>
+            </w:pPr>
+            <w:r/>
+            <w:r>
+              <w:rPr>
+                <w:sz w:val="19"/>
+              </w:rPr>
+              <w:t>19%</w:t>
+            </w:r>
+          </w:p>
+        </w:tc>
+      </w:tr>
+      <w:tr>
+        <w:tc>
+          <w:tcPr>
+            <w:tcW w:type="dxa" w:w="1474"/>
+          </w:tcPr>
+          <w:p>
+            <w:r/>
+            <w:r>
+              <w:rPr>
+                <w:sz w:val="19"/>
+              </w:rPr>
+              <w:t>AUT</w:t>
+            </w:r>
+          </w:p>
+        </w:tc>
+        <w:tc>
+          <w:tcPr>
+            <w:tcW w:type="dxa" w:w="1361"/>
+          </w:tcPr>
+          <w:p>
+            <w:pPr>
+              <w:jc w:val="right"/>
+            </w:pPr>
+            <w:r/>
+            <w:r>
+              <w:rPr>
+                <w:sz w:val="19"/>
+              </w:rPr>
+              <w:t>46</w:t>
+            </w:r>
+          </w:p>
+        </w:tc>
+        <w:tc>
+          <w:tcPr>
+            <w:tcW w:type="dxa" w:w="1361"/>
+          </w:tcPr>
+          <w:p>
+            <w:pPr>
+              <w:jc w:val="right"/>
+            </w:pPr>
+            <w:r/>
+            <w:r>
+              <w:rPr>
+                <w:sz w:val="19"/>
+              </w:rPr>
+              <w:t>26</w:t>
+            </w:r>
+          </w:p>
+        </w:tc>
+        <w:tc>
+          <w:tcPr>
+            <w:tcW w:type="dxa" w:w="1361"/>
+          </w:tcPr>
+          <w:p>
+            <w:pPr>
+              <w:jc w:val="right"/>
+            </w:pPr>
+            <w:r/>
+            <w:r>
+              <w:rPr>
+                <w:sz w:val="19"/>
+              </w:rPr>
+              <w:t>56</w:t>
+            </w:r>
+          </w:p>
+        </w:tc>
+        <w:tc>
+          <w:tcPr>
+            <w:tcW w:type="dxa" w:w="1361"/>
+          </w:tcPr>
+          <w:p>
+            <w:pPr>
+              <w:jc w:val="right"/>
+            </w:pPr>
+            <w:r/>
+            <w:r>
+              <w:rPr>
+                <w:sz w:val="19"/>
+              </w:rPr>
+              <w:t>122</w:t>
+            </w:r>
+          </w:p>
+        </w:tc>
+        <w:tc>
+          <w:tcPr>
+            <w:tcW w:type="dxa" w:w="1361"/>
+          </w:tcPr>
+          <w:p>
+            <w:pPr>
+              <w:jc w:val="right"/>
+            </w:pPr>
+            <w:r/>
+            <w:r>
+              <w:rPr>
+                <w:sz w:val="19"/>
+              </w:rPr>
+              <w:t>59%</w:t>
+            </w:r>
+          </w:p>
+        </w:tc>
+      </w:tr>
+      <w:tr>
+        <w:tc>
+          <w:tcPr>
+            <w:tcW w:type="dxa" w:w="1474"/>
+          </w:tcPr>
+          <w:p>
+            <w:r/>
+            <w:r>
+              <w:rPr>
+                <w:sz w:val="19"/>
+              </w:rPr>
+              <w:t>GBR</w:t>
+            </w:r>
+          </w:p>
+        </w:tc>
+        <w:tc>
+          <w:tcPr>
+            <w:tcW w:type="dxa" w:w="1361"/>
+          </w:tcPr>
+          <w:p>
+            <w:pPr>
+              <w:jc w:val="right"/>
+            </w:pPr>
+            <w:r/>
+            <w:r>
+              <w:rPr>
+                <w:sz w:val="19"/>
+              </w:rPr>
+              <w:t>37</w:t>
+            </w:r>
+          </w:p>
+        </w:tc>
+        <w:tc>
+          <w:tcPr>
+            <w:tcW w:type="dxa" w:w="1361"/>
+          </w:tcPr>
+          <w:p>
+            <w:pPr>
+              <w:jc w:val="right"/>
+            </w:pPr>
+            <w:r/>
+            <w:r>
+              <w:rPr>
+                <w:sz w:val="19"/>
+              </w:rPr>
+              <w:t>120</w:t>
+            </w:r>
+          </w:p>
+        </w:tc>
+        <w:tc>
+          <w:tcPr>
+            <w:tcW w:type="dxa" w:w="1361"/>
+          </w:tcPr>
+          <w:p>
+            <w:pPr>
+              <w:jc w:val="right"/>
+            </w:pPr>
+            <w:r/>
+            <w:r>
+              <w:rPr>
+                <w:sz w:val="19"/>
+              </w:rPr>
+              <w:t>99</w:t>
+            </w:r>
+          </w:p>
+        </w:tc>
+        <w:tc>
+          <w:tcPr>
+            <w:tcW w:type="dxa" w:w="1361"/>
+          </w:tcPr>
+          <w:p>
+            <w:pPr>
+              <w:jc w:val="right"/>
+            </w:pPr>
+            <w:r/>
+            <w:r>
+              <w:rPr>
+                <w:sz w:val="19"/>
+              </w:rPr>
+              <w:t>154</w:t>
+            </w:r>
+          </w:p>
+        </w:tc>
+        <w:tc>
+          <w:tcPr>
+            <w:tcW w:type="dxa" w:w="1361"/>
+          </w:tcPr>
+          <w:p>
+            <w:pPr>
+              <w:jc w:val="right"/>
+            </w:pPr>
+            <w:r/>
+            <w:r>
+              <w:rPr>
+                <w:sz w:val="19"/>
+              </w:rPr>
+              <w:t>27%</w:t>
+            </w:r>
+          </w:p>
+        </w:tc>
+      </w:tr>
+      <w:tr>
+        <w:tc>
+          <w:tcPr>
+            <w:tcW w:type="dxa" w:w="1474"/>
+          </w:tcPr>
+          <w:p>
+            <w:r/>
+            <w:r>
+              <w:rPr>
+                <w:sz w:val="19"/>
+              </w:rPr>
+              <w:t>CZE</w:t>
+            </w:r>
+          </w:p>
+        </w:tc>
+        <w:tc>
+          <w:tcPr>
+            <w:tcW w:type="dxa" w:w="1361"/>
+          </w:tcPr>
+          <w:p>
+            <w:pPr>
+              <w:jc w:val="right"/>
+            </w:pPr>
+            <w:r/>
+            <w:r>
+              <w:rPr>
+                <w:sz w:val="19"/>
+              </w:rPr>
+              <w:t>36</w:t>
+            </w:r>
+          </w:p>
+        </w:tc>
+        <w:tc>
+          <w:tcPr>
+            <w:tcW w:type="dxa" w:w="1361"/>
+          </w:tcPr>
+          <w:p>
+            <w:pPr>
+              <w:jc w:val="right"/>
+            </w:pPr>
+            <w:r/>
+            <w:r>
+              <w:rPr>
+                <w:sz w:val="19"/>
+              </w:rPr>
+              <w:t>108</w:t>
+            </w:r>
+          </w:p>
+        </w:tc>
+        <w:tc>
+          <w:tcPr>
+            <w:tcW w:type="dxa" w:w="1361"/>
+          </w:tcPr>
+          <w:p>
+            <w:pPr>
+              <w:jc w:val="right"/>
+            </w:pPr>
+            <w:r/>
+            <w:r>
+              <w:rPr>
+                <w:sz w:val="19"/>
+              </w:rPr>
+              <w:t>108</w:t>
+            </w:r>
+          </w:p>
+        </w:tc>
+        <w:tc>
+          <w:tcPr>
+            <w:tcW w:type="dxa" w:w="1361"/>
+          </w:tcPr>
+          <w:p>
+            <w:pPr>
+              <w:jc w:val="right"/>
+            </w:pPr>
+            <w:r/>
+            <w:r>
+              <w:rPr>
+                <w:sz w:val="19"/>
+              </w:rPr>
+              <w:t>168</w:t>
+            </w:r>
+          </w:p>
+        </w:tc>
+        <w:tc>
+          <w:tcPr>
+            <w:tcW w:type="dxa" w:w="1361"/>
+          </w:tcPr>
+          <w:p>
+            <w:pPr>
+              <w:jc w:val="right"/>
+            </w:pPr>
+            <w:r/>
+            <w:r>
+              <w:rPr>
+                <w:sz w:val="19"/>
+              </w:rPr>
+              <w:t>6%</w:t>
+            </w:r>
+          </w:p>
+        </w:tc>
+      </w:tr>
+      <w:tr>
+        <w:tc>
+          <w:tcPr>
+            <w:tcW w:type="dxa" w:w="1474"/>
+          </w:tcPr>
+          <w:p>
+            <w:r/>
+            <w:r>
+              <w:rPr>
+                <w:sz w:val="19"/>
+              </w:rPr>
+              <w:t>ITA</w:t>
+            </w:r>
+          </w:p>
+        </w:tc>
+        <w:tc>
+          <w:tcPr>
+            <w:tcW w:type="dxa" w:w="1361"/>
+          </w:tcPr>
+          <w:p>
+            <w:pPr>
+              <w:jc w:val="right"/>
+            </w:pPr>
+            <w:r/>
+            <w:r>
+              <w:rPr>
+                <w:sz w:val="19"/>
+              </w:rPr>
+              <w:t>34</w:t>
+            </w:r>
+          </w:p>
+        </w:tc>
+        <w:tc>
+          <w:tcPr>
+            <w:tcW w:type="dxa" w:w="1361"/>
+          </w:tcPr>
+          <w:p>
+            <w:pPr>
+              <w:jc w:val="right"/>
+            </w:pPr>
+            <w:r/>
+            <w:r>
+              <w:rPr>
+                <w:sz w:val="19"/>
+              </w:rPr>
+              <w:t>108</w:t>
+            </w:r>
+          </w:p>
+        </w:tc>
+        <w:tc>
+          <w:tcPr>
+            <w:tcW w:type="dxa" w:w="1361"/>
+          </w:tcPr>
+          <w:p>
+            <w:pPr>
+              <w:jc w:val="right"/>
+            </w:pPr>
+            <w:r/>
+            <w:r>
+              <w:rPr>
+                <w:sz w:val="19"/>
+              </w:rPr>
+              <w:t>96</w:t>
+            </w:r>
+          </w:p>
+        </w:tc>
+        <w:tc>
+          <w:tcPr>
+            <w:tcW w:type="dxa" w:w="1361"/>
+          </w:tcPr>
+          <w:p>
+            <w:pPr>
+              <w:jc w:val="right"/>
+            </w:pPr>
+            <w:r/>
+            <w:r>
+              <w:rPr>
+                <w:sz w:val="19"/>
+              </w:rPr>
+              <w:t>144</w:t>
+            </w:r>
+          </w:p>
+        </w:tc>
+        <w:tc>
+          <w:tcPr>
+            <w:tcW w:type="dxa" w:w="1361"/>
+          </w:tcPr>
+          <w:p>
+            <w:pPr>
+              <w:jc w:val="right"/>
+            </w:pPr>
+            <w:r/>
+            <w:r>
+              <w:rPr>
+                <w:sz w:val="19"/>
+              </w:rPr>
+              <w:t>18%</w:t>
+            </w:r>
+          </w:p>
+        </w:tc>
+      </w:tr>
+      <w:tr>
+        <w:tc>
+          <w:tcPr>
+            <w:tcW w:type="dxa" w:w="1474"/>
+          </w:tcPr>
+          <w:p>
+            <w:r/>
+            <w:r>
+              <w:rPr>
+                <w:sz w:val="19"/>
+              </w:rPr>
+              <w:t>EST</w:t>
+            </w:r>
+          </w:p>
+        </w:tc>
+        <w:tc>
+          <w:tcPr>
+            <w:tcW w:type="dxa" w:w="1361"/>
+          </w:tcPr>
+          <w:p>
+            <w:pPr>
+              <w:jc w:val="right"/>
+            </w:pPr>
+            <w:r/>
+            <w:r>
+              <w:rPr>
+                <w:sz w:val="19"/>
+              </w:rPr>
+              <w:t>33</w:t>
+            </w:r>
+          </w:p>
+        </w:tc>
+        <w:tc>
+          <w:tcPr>
+            <w:tcW w:type="dxa" w:w="1361"/>
+          </w:tcPr>
+          <w:p>
+            <w:pPr>
+              <w:jc w:val="right"/>
+            </w:pPr>
+            <w:r/>
+            <w:r>
+              <w:rPr>
+                <w:sz w:val="19"/>
+              </w:rPr>
+              <w:t>74</w:t>
+            </w:r>
+          </w:p>
+        </w:tc>
+        <w:tc>
+          <w:tcPr>
+            <w:tcW w:type="dxa" w:w="1361"/>
+          </w:tcPr>
+          <w:p>
+            <w:pPr>
+              <w:jc w:val="right"/>
+            </w:pPr>
+            <w:r/>
+            <w:r>
+              <w:rPr>
+                <w:sz w:val="19"/>
+              </w:rPr>
+              <w:t>113</w:t>
+            </w:r>
+          </w:p>
+        </w:tc>
+        <w:tc>
+          <w:tcPr>
+            <w:tcW w:type="dxa" w:w="1361"/>
+          </w:tcPr>
+          <w:p>
+            <w:pPr>
+              <w:jc w:val="right"/>
+            </w:pPr>
+            <w:r/>
+            <w:r>
+              <w:rPr>
+                <w:sz w:val="19"/>
+              </w:rPr>
+              <w:t>230</w:t>
+            </w:r>
+          </w:p>
+        </w:tc>
+        <w:tc>
+          <w:tcPr>
+            <w:tcW w:type="dxa" w:w="1361"/>
+          </w:tcPr>
+          <w:p>
+            <w:pPr>
+              <w:jc w:val="right"/>
+            </w:pPr>
+            <w:r/>
+            <w:r>
+              <w:rPr>
+                <w:sz w:val="19"/>
+              </w:rPr>
+              <w:t>18%</w:t>
+            </w:r>
+          </w:p>
+        </w:tc>
+      </w:tr>
+      <w:tr>
+        <w:tc>
+          <w:tcPr>
+            <w:tcW w:type="dxa" w:w="1474"/>
+          </w:tcPr>
+          <w:p>
+            <w:r/>
+            <w:r>
+              <w:rPr>
+                <w:sz w:val="19"/>
+              </w:rPr>
+              <w:t>SWE</w:t>
+            </w:r>
+          </w:p>
+        </w:tc>
+        <w:tc>
+          <w:tcPr>
+            <w:tcW w:type="dxa" w:w="1361"/>
+          </w:tcPr>
+          <w:p>
+            <w:pPr>
+              <w:jc w:val="right"/>
+            </w:pPr>
+            <w:r/>
+            <w:r>
+              <w:rPr>
+                <w:sz w:val="19"/>
+              </w:rPr>
+              <w:t>31</w:t>
+            </w:r>
+          </w:p>
+        </w:tc>
+        <w:tc>
+          <w:tcPr>
+            <w:tcW w:type="dxa" w:w="1361"/>
+          </w:tcPr>
+          <w:p>
+            <w:pPr>
+              <w:jc w:val="right"/>
+            </w:pPr>
+            <w:r/>
+            <w:r>
+              <w:rPr>
+                <w:sz w:val="19"/>
+              </w:rPr>
+              <w:t>71</w:t>
+            </w:r>
+          </w:p>
+        </w:tc>
+        <w:tc>
+          <w:tcPr>
+            <w:tcW w:type="dxa" w:w="1361"/>
+          </w:tcPr>
+          <w:p>
+            <w:pPr>
+              <w:jc w:val="right"/>
+            </w:pPr>
+            <w:r/>
+            <w:r>
+              <w:rPr>
+                <w:sz w:val="19"/>
+              </w:rPr>
+              <w:t>86</w:t>
+            </w:r>
+          </w:p>
+        </w:tc>
+        <w:tc>
+          <w:tcPr>
+            <w:tcW w:type="dxa" w:w="1361"/>
+          </w:tcPr>
+          <w:p>
+            <w:pPr>
+              <w:jc w:val="right"/>
+            </w:pPr>
+            <w:r/>
+            <w:r>
+              <w:rPr>
+                <w:sz w:val="19"/>
+              </w:rPr>
+              <w:t>146</w:t>
+            </w:r>
+          </w:p>
+        </w:tc>
+        <w:tc>
+          <w:tcPr>
+            <w:tcW w:type="dxa" w:w="1361"/>
+          </w:tcPr>
+          <w:p>
+            <w:pPr>
+              <w:jc w:val="right"/>
+            </w:pPr>
+            <w:r/>
+            <w:r>
+              <w:rPr>
+                <w:sz w:val="19"/>
+              </w:rPr>
+              <w:t>23%</w:t>
+            </w:r>
+          </w:p>
+        </w:tc>
+      </w:tr>
+      <w:tr>
+        <w:tc>
+          <w:tcPr>
+            <w:tcW w:type="dxa" w:w="1474"/>
+          </w:tcPr>
+          <w:p>
+            <w:r/>
+            <w:r>
+              <w:rPr>
+                <w:sz w:val="19"/>
+              </w:rPr>
+              <w:t>HRV</w:t>
+            </w:r>
+          </w:p>
+        </w:tc>
+        <w:tc>
+          <w:tcPr>
+            <w:tcW w:type="dxa" w:w="1361"/>
+          </w:tcPr>
+          <w:p>
+            <w:pPr>
+              <w:jc w:val="right"/>
+            </w:pPr>
+            <w:r/>
+            <w:r>
+              <w:rPr>
+                <w:sz w:val="19"/>
+              </w:rPr>
+              <w:t>31</w:t>
+            </w:r>
+          </w:p>
+        </w:tc>
+        <w:tc>
+          <w:tcPr>
+            <w:tcW w:type="dxa" w:w="1361"/>
+          </w:tcPr>
+          <w:p>
+            <w:pPr>
+              <w:jc w:val="right"/>
+            </w:pPr>
+            <w:r/>
+            <w:r>
+              <w:rPr>
+                <w:sz w:val="19"/>
+              </w:rPr>
+              <w:t>144</w:t>
+            </w:r>
+          </w:p>
+        </w:tc>
+        <w:tc>
+          <w:tcPr>
+            <w:tcW w:type="dxa" w:w="1361"/>
+          </w:tcPr>
+          <w:p>
+            <w:pPr>
+              <w:jc w:val="right"/>
+            </w:pPr>
+            <w:r/>
+            <w:r>
+              <w:rPr>
+                <w:sz w:val="19"/>
+              </w:rPr>
+              <w:t>128</w:t>
+            </w:r>
+          </w:p>
+        </w:tc>
+        <w:tc>
+          <w:tcPr>
+            <w:tcW w:type="dxa" w:w="1361"/>
+          </w:tcPr>
+          <w:p>
+            <w:pPr>
+              <w:jc w:val="right"/>
+            </w:pPr>
+            <w:r/>
+            <w:r>
+              <w:rPr>
+                <w:sz w:val="19"/>
+              </w:rPr>
+              <w:t>149</w:t>
+            </w:r>
+          </w:p>
+        </w:tc>
+        <w:tc>
+          <w:tcPr>
+            <w:tcW w:type="dxa" w:w="1361"/>
+          </w:tcPr>
+          <w:p>
+            <w:pPr>
+              <w:jc w:val="right"/>
+            </w:pPr>
+            <w:r/>
+            <w:r>
+              <w:rPr>
+                <w:sz w:val="19"/>
+              </w:rPr>
+              <w:t>13%</w:t>
+            </w:r>
+          </w:p>
+        </w:tc>
+      </w:tr>
+      <w:tr>
+        <w:tc>
+          <w:tcPr>
+            <w:tcW w:type="dxa" w:w="1474"/>
+          </w:tcPr>
+          <w:p>
+            <w:r/>
+            <w:r>
+              <w:rPr>
+                <w:sz w:val="19"/>
+              </w:rPr>
+              <w:t>ISR</w:t>
+            </w:r>
+          </w:p>
+        </w:tc>
+        <w:tc>
+          <w:tcPr>
+            <w:tcW w:type="dxa" w:w="1361"/>
+          </w:tcPr>
+          <w:p>
+            <w:pPr>
+              <w:jc w:val="right"/>
+            </w:pPr>
+            <w:r/>
+            <w:r>
+              <w:rPr>
+                <w:sz w:val="19"/>
+              </w:rPr>
+              <w:t>25</w:t>
+            </w:r>
+          </w:p>
+        </w:tc>
+        <w:tc>
+          <w:tcPr>
+            <w:tcW w:type="dxa" w:w="1361"/>
+          </w:tcPr>
+          <w:p>
+            <w:pPr>
+              <w:jc w:val="right"/>
+            </w:pPr>
+            <w:r/>
+            <w:r>
+              <w:rPr>
+                <w:sz w:val="19"/>
+              </w:rPr>
+              <w:t>148</w:t>
+            </w:r>
+          </w:p>
+        </w:tc>
+        <w:tc>
+          <w:tcPr>
+            <w:tcW w:type="dxa" w:w="1361"/>
+          </w:tcPr>
+          <w:p>
+            <w:pPr>
+              <w:jc w:val="right"/>
+            </w:pPr>
+            <w:r/>
+            <w:r>
+              <w:rPr>
+                <w:sz w:val="19"/>
+              </w:rPr>
+              <w:t>124</w:t>
+            </w:r>
+          </w:p>
+        </w:tc>
+        <w:tc>
+          <w:tcPr>
+            <w:tcW w:type="dxa" w:w="1361"/>
+          </w:tcPr>
+          <w:p>
+            <w:pPr>
+              <w:jc w:val="right"/>
+            </w:pPr>
+            <w:r/>
+            <w:r>
+              <w:rPr>
+                <w:sz w:val="19"/>
+              </w:rPr>
+              <w:t>184</w:t>
+            </w:r>
+          </w:p>
+        </w:tc>
+        <w:tc>
+          <w:tcPr>
+            <w:tcW w:type="dxa" w:w="1361"/>
+          </w:tcPr>
+          <w:p>
+            <w:pPr>
+              <w:jc w:val="right"/>
+            </w:pPr>
+            <w:r/>
+            <w:r>
+              <w:rPr>
+                <w:sz w:val="19"/>
+              </w:rPr>
+              <w:t>4%</w:t>
+            </w:r>
+          </w:p>
+        </w:tc>
+      </w:tr>
+      <w:tr>
+        <w:tc>
+          <w:tcPr>
+            <w:tcW w:type="dxa" w:w="1474"/>
+          </w:tcPr>
+          <w:p>
+            <w:r/>
+            <w:r>
+              <w:rPr>
+                <w:sz w:val="19"/>
+              </w:rPr>
+              <w:t>FIN</w:t>
+            </w:r>
+          </w:p>
+        </w:tc>
+        <w:tc>
+          <w:tcPr>
+            <w:tcW w:type="dxa" w:w="1361"/>
+          </w:tcPr>
+          <w:p>
+            <w:pPr>
+              <w:jc w:val="right"/>
+            </w:pPr>
+            <w:r/>
+            <w:r>
+              <w:rPr>
+                <w:sz w:val="19"/>
+              </w:rPr>
+              <w:t>24</w:t>
+            </w:r>
+          </w:p>
+        </w:tc>
+        <w:tc>
+          <w:tcPr>
+            <w:tcW w:type="dxa" w:w="1361"/>
+          </w:tcPr>
+          <w:p>
+            <w:pPr>
+              <w:jc w:val="right"/>
+            </w:pPr>
+            <w:r/>
+            <w:r>
+              <w:rPr>
+                <w:sz w:val="19"/>
+              </w:rPr>
+              <w:t>71</w:t>
+            </w:r>
+          </w:p>
+        </w:tc>
+        <w:tc>
+          <w:tcPr>
+            <w:tcW w:type="dxa" w:w="1361"/>
+          </w:tcPr>
+          <w:p>
+            <w:pPr>
+              <w:jc w:val="right"/>
+            </w:pPr>
+            <w:r/>
+            <w:r>
+              <w:rPr>
+                <w:sz w:val="19"/>
+              </w:rPr>
+              <w:t>119</w:t>
+            </w:r>
+          </w:p>
+        </w:tc>
+        <w:tc>
+          <w:tcPr>
+            <w:tcW w:type="dxa" w:w="1361"/>
+          </w:tcPr>
+          <w:p>
+            <w:pPr>
+              <w:jc w:val="right"/>
+            </w:pPr>
+            <w:r/>
+            <w:r>
+              <w:rPr>
+                <w:sz w:val="19"/>
+              </w:rPr>
+              <w:t>264</w:t>
+            </w:r>
+          </w:p>
+        </w:tc>
+        <w:tc>
+          <w:tcPr>
+            <w:tcW w:type="dxa" w:w="1361"/>
+          </w:tcPr>
+          <w:p>
+            <w:pPr>
+              <w:jc w:val="right"/>
+            </w:pPr>
+            <w:r/>
+            <w:r>
+              <w:rPr>
+                <w:sz w:val="19"/>
+              </w:rPr>
+              <w:t>0%</w:t>
+            </w:r>
+          </w:p>
+        </w:tc>
+      </w:tr>
+      <w:tr>
+        <w:tc>
+          <w:tcPr>
+            <w:tcW w:type="dxa" w:w="1474"/>
+          </w:tcPr>
+          <w:p>
+            <w:r/>
+            <w:r>
+              <w:rPr>
+                <w:sz w:val="19"/>
+              </w:rPr>
+              <w:t>ESP</w:t>
+            </w:r>
+          </w:p>
+        </w:tc>
+        <w:tc>
+          <w:tcPr>
+            <w:tcW w:type="dxa" w:w="1361"/>
+          </w:tcPr>
+          <w:p>
+            <w:pPr>
+              <w:jc w:val="right"/>
+            </w:pPr>
+            <w:r/>
+            <w:r>
+              <w:rPr>
+                <w:sz w:val="19"/>
+              </w:rPr>
+              <w:t>22</w:t>
+            </w:r>
+          </w:p>
+        </w:tc>
+        <w:tc>
+          <w:tcPr>
+            <w:tcW w:type="dxa" w:w="1361"/>
+          </w:tcPr>
+          <w:p>
+            <w:pPr>
+              <w:jc w:val="right"/>
+            </w:pPr>
+            <w:r/>
+            <w:r>
+              <w:rPr>
+                <w:sz w:val="19"/>
+              </w:rPr>
+              <w:t>75</w:t>
+            </w:r>
+          </w:p>
+        </w:tc>
+        <w:tc>
+          <w:tcPr>
+            <w:tcW w:type="dxa" w:w="1361"/>
+          </w:tcPr>
+          <w:p>
+            <w:pPr>
+              <w:jc w:val="right"/>
+            </w:pPr>
+            <w:r/>
+            <w:r>
+              <w:rPr>
+                <w:sz w:val="19"/>
+              </w:rPr>
+              <w:t>78</w:t>
+            </w:r>
+          </w:p>
+        </w:tc>
+        <w:tc>
+          <w:tcPr>
+            <w:tcW w:type="dxa" w:w="1361"/>
+          </w:tcPr>
+          <w:p>
+            <w:pPr>
+              <w:jc w:val="right"/>
+            </w:pPr>
+            <w:r/>
+            <w:r>
+              <w:rPr>
+                <w:sz w:val="19"/>
+              </w:rPr>
+              <w:t>140</w:t>
+            </w:r>
+          </w:p>
+        </w:tc>
+        <w:tc>
+          <w:tcPr>
+            <w:tcW w:type="dxa" w:w="1361"/>
+          </w:tcPr>
+          <w:p>
+            <w:pPr>
+              <w:jc w:val="right"/>
+            </w:pPr>
+            <w:r/>
+            <w:r>
+              <w:rPr>
+                <w:sz w:val="19"/>
+              </w:rPr>
+              <w:t>27%</w:t>
+            </w:r>
+          </w:p>
+        </w:tc>
+      </w:tr>
+      <w:tr>
+        <w:tc>
+          <w:tcPr>
+            <w:tcW w:type="dxa" w:w="1474"/>
+          </w:tcPr>
+          <w:p>
+            <w:r/>
+            <w:r>
+              <w:rPr>
+                <w:sz w:val="19"/>
+              </w:rPr>
+              <w:t>SVN</w:t>
+            </w:r>
+          </w:p>
+        </w:tc>
+        <w:tc>
+          <w:tcPr>
+            <w:tcW w:type="dxa" w:w="1361"/>
+          </w:tcPr>
+          <w:p>
+            <w:pPr>
+              <w:jc w:val="right"/>
+            </w:pPr>
+            <w:r/>
+            <w:r>
+              <w:rPr>
+                <w:sz w:val="19"/>
+              </w:rPr>
+              <w:t>20</w:t>
+            </w:r>
+          </w:p>
+        </w:tc>
+        <w:tc>
+          <w:tcPr>
+            <w:tcW w:type="dxa" w:w="1361"/>
+          </w:tcPr>
+          <w:p>
+            <w:pPr>
+              <w:jc w:val="right"/>
+            </w:pPr>
+            <w:r/>
+            <w:r>
+              <w:rPr>
+                <w:sz w:val="19"/>
+              </w:rPr>
+              <w:t>142</w:t>
+            </w:r>
+          </w:p>
+        </w:tc>
+        <w:tc>
+          <w:tcPr>
+            <w:tcW w:type="dxa" w:w="1361"/>
+          </w:tcPr>
+          <w:p>
+            <w:pPr>
+              <w:jc w:val="right"/>
+            </w:pPr>
+            <w:r/>
+            <w:r>
+              <w:rPr>
+                <w:sz w:val="19"/>
+              </w:rPr>
+              <w:t>131</w:t>
+            </w:r>
+          </w:p>
+        </w:tc>
+        <w:tc>
+          <w:tcPr>
+            <w:tcW w:type="dxa" w:w="1361"/>
+          </w:tcPr>
+          <w:p>
+            <w:pPr>
+              <w:jc w:val="right"/>
+            </w:pPr>
+            <w:r/>
+            <w:r>
+              <w:rPr>
+                <w:sz w:val="19"/>
+              </w:rPr>
+              <w:t>170</w:t>
+            </w:r>
+          </w:p>
+        </w:tc>
+        <w:tc>
+          <w:tcPr>
+            <w:tcW w:type="dxa" w:w="1361"/>
+          </w:tcPr>
+          <w:p>
+            <w:pPr>
+              <w:jc w:val="right"/>
+            </w:pPr>
+            <w:r/>
+            <w:r>
+              <w:rPr>
+                <w:sz w:val="19"/>
+              </w:rPr>
+              <w:t>15%</w:t>
+            </w:r>
+          </w:p>
+        </w:tc>
+      </w:tr>
+    </w:tbl>
+    <w:p>
+      <w:pPr>
+        <w:spacing w:after="40"/>
+      </w:pPr>
+    </w:p>
+    <w:p>
+      <w:pPr>
+        <w:pStyle w:val="ListBullet"/>
+      </w:pPr>
+      <w:r>
+        <w:rPr>
+          <w:b w:val="0"/>
+          <w:sz w:val="21"/>
+        </w:rPr>
+      </w:r>
+      <w:r>
+        <w:rPr>
+          <w:b/>
+          <w:sz w:val="21"/>
+        </w:rPr>
+        <w:t>NL, BE, DE, LU and FR ship in about a day</w:t>
+      </w:r>
+      <w:r>
+        <w:rPr>
+          <w:b w:val="0"/>
+          <w:sz w:val="21"/>
+        </w:rPr>
+        <w:t xml:space="preserve"> (median 8–25 h); </w:t>
+      </w:r>
+      <w:r>
+        <w:rPr>
+          <w:b/>
+          <w:sz w:val="21"/>
+        </w:rPr>
+        <w:t>Switzerland (~140 h) and Poland (~120 h) take 5–6 days</w:t>
+      </w:r>
+      <w:r>
+        <w:rPr>
+          <w:b w:val="0"/>
+          <w:sz w:val="21"/>
+        </w:rPr>
+        <w:t>, pointing at customs or weekly consolidation for export — a service question to raise with DHL.</w:t>
       </w:r>
     </w:p>
     <w:p>
@@ -3564,6 +5548,305 @@
         </w:rPr>
         <w:t xml:space="preserve"> — 855 shipped-not-stocked; a further set of stocked-not-shipped SKUs are dead-stock candidates. To confirm handling (cross-dock vs obsolete).</w:t>
       </w:r>
+    </w:p>
+    <w:p>
+      <w:pPr>
+        <w:spacing w:after="80"/>
+      </w:pPr>
+      <w:r>
+        <w:rPr>
+          <w:b w:val="0"/>
+          <w:i w:val="0"/>
+          <w:color w:val="222222"/>
+          <w:sz w:val="21"/>
+        </w:rPr>
+        <w:t>Data checks requested in class (Week 3):</w:t>
+      </w:r>
+    </w:p>
+    <w:tbl>
+      <w:tblPr>
+        <w:tblStyle w:val="LightGrid-Accent1"/>
+        <w:tblW w:type="auto" w:w="0"/>
+        <w:jc w:val="center"/>
+        <w:tblLook w:firstColumn="1" w:firstRow="1" w:lastColumn="0" w:lastRow="0" w:noHBand="0" w:noVBand="1" w:val="04A0"/>
+      </w:tblPr>
+      <w:tblGrid>
+        <w:gridCol w:w="2880"/>
+        <w:gridCol w:w="2880"/>
+        <w:gridCol w:w="2880"/>
+      </w:tblGrid>
+      <w:tr>
+        <w:tc>
+          <w:tcPr>
+            <w:tcW w:type="dxa" w:w="2381"/>
+          </w:tcPr>
+          <w:p>
+            <w:r/>
+            <w:r>
+              <w:rPr>
+                <w:b/>
+                <w:sz w:val="19"/>
+              </w:rPr>
+              <w:t>Question</w:t>
+            </w:r>
+          </w:p>
+        </w:tc>
+        <w:tc>
+          <w:tcPr>
+            <w:tcW w:type="dxa" w:w="3061"/>
+          </w:tcPr>
+          <w:p>
+            <w:r/>
+            <w:r>
+              <w:rPr>
+                <w:b/>
+                <w:sz w:val="19"/>
+              </w:rPr>
+              <w:t>Answer</w:t>
+            </w:r>
+          </w:p>
+        </w:tc>
+        <w:tc>
+          <w:tcPr>
+            <w:tcW w:type="dxa" w:w="3628"/>
+          </w:tcPr>
+          <w:p>
+            <w:r/>
+            <w:r>
+              <w:rPr>
+                <w:b/>
+                <w:sz w:val="19"/>
+              </w:rPr>
+              <w:t>Note</w:t>
+            </w:r>
+          </w:p>
+        </w:tc>
+      </w:tr>
+      <w:tr>
+        <w:tc>
+          <w:tcPr>
+            <w:tcW w:type="dxa" w:w="2381"/>
+          </w:tcPr>
+          <w:p>
+            <w:r/>
+            <w:r>
+              <w:rPr>
+                <w:sz w:val="19"/>
+              </w:rPr>
+              <w:t>Most ordered product</w:t>
+            </w:r>
+          </w:p>
+        </w:tc>
+        <w:tc>
+          <w:tcPr>
+            <w:tcW w:type="dxa" w:w="3061"/>
+          </w:tcPr>
+          <w:p>
+            <w:r/>
+            <w:r>
+              <w:rPr>
+                <w:sz w:val="19"/>
+              </w:rPr>
+              <w:t>A000493031 — in 268 orders</w:t>
+            </w:r>
+          </w:p>
+        </w:tc>
+        <w:tc>
+          <w:tcPr>
+            <w:tcW w:type="dxa" w:w="3628"/>
+          </w:tcPr>
+          <w:p>
+            <w:r/>
+            <w:r>
+              <w:rPr>
+                <w:sz w:val="19"/>
+              </w:rPr>
+              <w:t>1,947 units picked in Q2</w:t>
+            </w:r>
+          </w:p>
+        </w:tc>
+      </w:tr>
+      <w:tr>
+        <w:tc>
+          <w:tcPr>
+            <w:tcW w:type="dxa" w:w="2381"/>
+          </w:tcPr>
+          <w:p>
+            <w:r/>
+            <w:r>
+              <w:rPr>
+                <w:sz w:val="19"/>
+              </w:rPr>
+              <w:t>Heaviest SKU (single item)</w:t>
+            </w:r>
+          </w:p>
+        </w:tc>
+        <w:tc>
+          <w:tcPr>
+            <w:tcW w:type="dxa" w:w="3061"/>
+          </w:tcPr>
+          <w:p>
+            <w:r/>
+            <w:r>
+              <w:rPr>
+                <w:sz w:val="19"/>
+              </w:rPr>
+              <w:t>A000316052 — 90.0 kg per piece</w:t>
+            </w:r>
+          </w:p>
+        </w:tc>
+        <w:tc>
+          <w:tcPr>
+            <w:tcW w:type="dxa" w:w="3628"/>
+          </w:tcPr>
+          <w:p>
+            <w:r/>
+            <w:r>
+              <w:rPr>
+                <w:sz w:val="19"/>
+              </w:rPr>
+              <w:t>heaviest pallet (cleaned) 5,039 kg; p99 pallet 1,344 kg</w:t>
+            </w:r>
+          </w:p>
+        </w:tc>
+      </w:tr>
+      <w:tr>
+        <w:tc>
+          <w:tcPr>
+            <w:tcW w:type="dxa" w:w="2381"/>
+          </w:tcPr>
+          <w:p>
+            <w:r/>
+            <w:r>
+              <w:rPr>
+                <w:sz w:val="19"/>
+              </w:rPr>
+              <w:t>Longest SKU</w:t>
+            </w:r>
+          </w:p>
+        </w:tc>
+        <w:tc>
+          <w:tcPr>
+            <w:tcW w:type="dxa" w:w="3061"/>
+          </w:tcPr>
+          <w:p>
+            <w:r/>
+            <w:r>
+              <w:rPr>
+                <w:sz w:val="19"/>
+              </w:rPr>
+              <w:t>A000432677 — 1095 cm</w:t>
+            </w:r>
+          </w:p>
+        </w:tc>
+        <w:tc>
+          <w:tcPr>
+            <w:tcW w:type="dxa" w:w="3628"/>
+          </w:tcPr>
+          <w:p>
+            <w:r/>
+            <w:r>
+              <w:rPr>
+                <w:sz w:val="19"/>
+              </w:rPr>
+              <w:t>26 SKUs longer than 2.4 m -&gt; cantilever racking</w:t>
+            </w:r>
+          </w:p>
+        </w:tc>
+      </w:tr>
+      <w:tr>
+        <w:tc>
+          <w:tcPr>
+            <w:tcW w:type="dxa" w:w="2381"/>
+          </w:tcPr>
+          <w:p>
+            <w:r/>
+            <w:r>
+              <w:rPr>
+                <w:sz w:val="19"/>
+              </w:rPr>
+              <w:t>Most lines in one order</w:t>
+            </w:r>
+          </w:p>
+        </w:tc>
+        <w:tc>
+          <w:tcPr>
+            <w:tcW w:type="dxa" w:w="3061"/>
+          </w:tcPr>
+          <w:p>
+            <w:r/>
+            <w:r>
+              <w:rPr>
+                <w:sz w:val="19"/>
+              </w:rPr>
+              <w:t>191 lines</w:t>
+            </w:r>
+          </w:p>
+        </w:tc>
+        <w:tc>
+          <w:tcPr>
+            <w:tcW w:type="dxa" w:w="3628"/>
+          </w:tcPr>
+          <w:p>
+            <w:r/>
+            <w:r>
+              <w:rPr>
+                <w:sz w:val="19"/>
+              </w:rPr>
+              <w:t>median order = 1 line</w:t>
+            </w:r>
+          </w:p>
+        </w:tc>
+      </w:tr>
+      <w:tr>
+        <w:tc>
+          <w:tcPr>
+            <w:tcW w:type="dxa" w:w="2381"/>
+          </w:tcPr>
+          <w:p>
+            <w:r/>
+            <w:r>
+              <w:rPr>
+                <w:sz w:val="19"/>
+              </w:rPr>
+              <w:t>Max pallets in stock</w:t>
+            </w:r>
+          </w:p>
+        </w:tc>
+        <w:tc>
+          <w:tcPr>
+            <w:tcW w:type="dxa" w:w="3061"/>
+          </w:tcPr>
+          <w:p>
+            <w:r/>
+            <w:r>
+              <w:rPr>
+                <w:sz w:val="19"/>
+              </w:rPr>
+              <w:t>11,015 loads in 8,512 locations</w:t>
+            </w:r>
+          </w:p>
+        </w:tc>
+        <w:tc>
+          <w:tcPr>
+            <w:tcW w:type="dxa" w:w="3628"/>
+          </w:tcPr>
+          <w:p>
+            <w:r/>
+            <w:r>
+              <w:rPr>
+                <w:sz w:val="19"/>
+              </w:rPr>
+              <w:t>June 2025 snapshot (peak of the quarter)</w:t>
+            </w:r>
+          </w:p>
+        </w:tc>
+      </w:tr>
+    </w:tbl>
+    <w:p>
+      <w:pPr>
+        <w:spacing w:after="40"/>
+      </w:pPr>
     </w:p>
     <w:p>
       <w:pPr>
@@ -6420,6 +8703,53 @@
                 <w:sz w:val="19"/>
               </w:rPr>
               <w:t>Pick-time model parameters</w:t>
+            </w:r>
+          </w:p>
+        </w:tc>
+        <w:tc>
+          <w:tcPr>
+            <w:tcW w:type="dxa" w:w="1134"/>
+          </w:tcPr>
+          <w:p>
+            <w:pPr>
+              <w:jc w:val="right"/>
+            </w:pPr>
+            <w:r/>
+            <w:r>
+              <w:rPr>
+                <w:sz w:val="19"/>
+              </w:rPr>
+              <w:t>HIGH</w:t>
+            </w:r>
+          </w:p>
+        </w:tc>
+      </w:tr>
+      <w:tr>
+        <w:tc>
+          <w:tcPr>
+            <w:tcW w:type="dxa" w:w="850"/>
+          </w:tcPr>
+          <w:p>
+            <w:r/>
+            <w:r>
+              <w:rPr>
+                <w:sz w:val="19"/>
+              </w:rPr>
+              <w:t>A028</w:t>
+            </w:r>
+          </w:p>
+        </w:tc>
+        <w:tc>
+          <w:tcPr>
+            <w:tcW w:type="dxa" w:w="6520"/>
+          </w:tcPr>
+          <w:p>
+            <w:r/>
+            <w:r>
+              <w:rPr>
+                <w:sz w:val="19"/>
+              </w:rPr>
+              <w:t>Hazardous SKUs: hazard class unknown - PGS 15 (packaged hazardous substances) or PGS 37 (lithium batteries) to be confirmed</w:t>
             </w:r>
           </w:p>
         </w:tc>

</xml_diff>

<commit_message>
Deliverable 3: KPIs, CAPEX/OPEX, sorting, machinery review
- New performance_cost.py: KPI set (today vs future), per-order lead-time
  model, CAPEX/OPEX from the capacity plan, unit costs, payback, sensitivity
  and the 150-250% volume stress test promised in D2.
- New Deliverable 3 report and a calculation workbook with live formulas.
- Design updates: single-deep back-to-back racks (no telescopic forks),
  a 190 m2 loose-container zone at door R1, fleet reviewed to 2 ETV 216i /
  3 EJE 120i / 2 ERE 225, load checks on actual weights, lengths, heights.
- Floor plan now counts positions (9,504) and owns the zone areas; Blender
  scripts updated (Cycles fallback for machines without a GPU).
- D1/D2 regenerated with the same numbers; assumptions A030-A041 and
  sources S018-S025 added; README updated.

Co-Authored-By: Claude Opus 5.5 <noreply@anthropic.com>
Claude-Session: https://claude.ai/code/session_019BDu8Mejto8wmgVTUqspvV
</commit_message>
<xml_diff>
--- a/deliverables/Deliverable_1_Analysis.docx
+++ b/deliverables/Deliverable_1_Analysis.docx
@@ -822,7 +822,7 @@
       <w:r>
         <w:drawing>
           <wp:inline xmlns:a="http://schemas.openxmlformats.org/drawingml/2006/main" xmlns:pic="http://schemas.openxmlformats.org/drawingml/2006/picture">
-            <wp:extent cx="4320000" cy="2715066"/>
+            <wp:extent cx="4320000" cy="2711824"/>
             <wp:docPr id="1" name="Picture 1"/>
             <wp:cNvGraphicFramePr>
               <a:graphicFrameLocks noChangeAspect="1"/>
@@ -843,7 +843,7 @@
                   <pic:spPr>
                     <a:xfrm>
                       <a:off x="0" y="0"/>
-                      <a:ext cx="4320000" cy="2715066"/>
+                      <a:ext cx="4320000" cy="2711824"/>
                     </a:xfrm>
                     <a:prstGeom prst="rect"/>
                   </pic:spPr>
@@ -934,7 +934,7 @@
                 <w:b/>
                 <w:sz w:val="19"/>
               </w:rPr>
-              <w:t>Loads (positions)</w:t>
+              <w:t>Loads</w:t>
             </w:r>
           </w:p>
         </w:tc>
@@ -1388,7 +1388,7 @@
       <w:r>
         <w:drawing>
           <wp:inline xmlns:a="http://schemas.openxmlformats.org/drawingml/2006/main" xmlns:pic="http://schemas.openxmlformats.org/drawingml/2006/picture">
-            <wp:extent cx="4680000" cy="2721086"/>
+            <wp:extent cx="4680000" cy="2700763"/>
             <wp:docPr id="2" name="Picture 2"/>
             <wp:cNvGraphicFramePr>
               <a:graphicFrameLocks noChangeAspect="1"/>
@@ -1409,7 +1409,7 @@
                   <pic:spPr>
                     <a:xfrm>
                       <a:off x="0" y="0"/>
-                      <a:ext cx="4680000" cy="2721086"/>
+                      <a:ext cx="4680000" cy="2700763"/>
                     </a:xfrm>
                     <a:prstGeom prst="rect"/>
                   </pic:spPr>
@@ -1442,7 +1442,7 @@
       <w:r>
         <w:drawing>
           <wp:inline xmlns:a="http://schemas.openxmlformats.org/drawingml/2006/main" xmlns:pic="http://schemas.openxmlformats.org/drawingml/2006/picture">
-            <wp:extent cx="4680000" cy="2743650"/>
+            <wp:extent cx="4680000" cy="2723225"/>
             <wp:docPr id="3" name="Picture 3"/>
             <wp:cNvGraphicFramePr>
               <a:graphicFrameLocks noChangeAspect="1"/>
@@ -1463,7 +1463,7 @@
                   <pic:spPr>
                     <a:xfrm>
                       <a:off x="0" y="0"/>
-                      <a:ext cx="4680000" cy="2743650"/>
+                      <a:ext cx="4680000" cy="2723225"/>
                     </a:xfrm>
                     <a:prstGeom prst="rect"/>
                   </pic:spPr>
@@ -1972,21 +1972,21 @@
           <w:b w:val="0"/>
           <w:sz w:val="21"/>
         </w:rPr>
-        <w:t xml:space="preserve">Delivery lead time (order received → dispatched): </w:t>
+        <w:t xml:space="preserve">Delivery lead time (order received → trailer leaves), </w:t>
       </w:r>
       <w:r>
         <w:rPr>
           <w:b/>
           <w:sz w:val="21"/>
         </w:rPr>
-        <w:t>average 78.3 h (~3.3 days)</w:t>
+        <w:t>per order: median 25 h, average 45 h, p90 102 h</w:t>
       </w:r>
       <w:r>
         <w:rPr>
           <w:b w:val="0"/>
           <w:sz w:val="21"/>
         </w:rPr>
-        <w:t>, median 52.4 h (~2.2 days), p90 166.9 h. Right-skewed (mean &gt; median), so the typical order is nearer the median; measured as TRAILER DISPATCED DATE − ORDER ARRIVE DATE.</w:t>
+        <w:t>; 26% of orders leave the same day. Counted per order line instead the median is 52 h, because big multi-line orders wait longest. Measured as last TRAILER DISPATCED DATE − ORDER ARRIVE DATE of each order.</w:t>
       </w:r>
     </w:p>
     <w:p>
@@ -2018,7 +2018,7 @@
       <w:r>
         <w:drawing>
           <wp:inline xmlns:a="http://schemas.openxmlformats.org/drawingml/2006/main" xmlns:pic="http://schemas.openxmlformats.org/drawingml/2006/picture">
-            <wp:extent cx="4680000" cy="2067160"/>
+            <wp:extent cx="4680000" cy="1779718"/>
             <wp:docPr id="4" name="Picture 4"/>
             <wp:cNvGraphicFramePr>
               <a:graphicFrameLocks noChangeAspect="1"/>
@@ -2039,7 +2039,7 @@
                   <pic:spPr>
                     <a:xfrm>
                       <a:off x="0" y="0"/>
-                      <a:ext cx="4680000" cy="2067160"/>
+                      <a:ext cx="4680000" cy="1779718"/>
                     </a:xfrm>
                     <a:prstGeom prst="rect"/>
                   </pic:spPr>
@@ -4553,7 +4553,7 @@
               <w:rPr>
                 <w:sz w:val="19"/>
               </w:rPr>
-              <w:t>30.0%</w:t>
+              <w:t>29.9%</w:t>
             </w:r>
           </w:p>
         </w:tc>
@@ -4716,7 +4716,7 @@
       <w:r>
         <w:drawing>
           <wp:inline xmlns:a="http://schemas.openxmlformats.org/drawingml/2006/main" xmlns:pic="http://schemas.openxmlformats.org/drawingml/2006/picture">
-            <wp:extent cx="4680000" cy="2976285"/>
+            <wp:extent cx="4680000" cy="2972525"/>
             <wp:docPr id="5" name="Picture 5"/>
             <wp:cNvGraphicFramePr>
               <a:graphicFrameLocks noChangeAspect="1"/>
@@ -4737,7 +4737,7 @@
                   <pic:spPr>
                     <a:xfrm>
                       <a:off x="0" y="0"/>
-                      <a:ext cx="4680000" cy="2976285"/>
+                      <a:ext cx="4680000" cy="2972525"/>
                     </a:xfrm>
                     <a:prstGeom prst="rect"/>
                   </pic:spPr>
@@ -4770,7 +4770,7 @@
       <w:r>
         <w:drawing>
           <wp:inline xmlns:a="http://schemas.openxmlformats.org/drawingml/2006/main" xmlns:pic="http://schemas.openxmlformats.org/drawingml/2006/picture">
-            <wp:extent cx="5400000" cy="4149817"/>
+            <wp:extent cx="5400000" cy="4156363"/>
             <wp:docPr id="6" name="Picture 6"/>
             <wp:cNvGraphicFramePr>
               <a:graphicFrameLocks noChangeAspect="1"/>
@@ -4791,7 +4791,7 @@
                   <pic:spPr>
                     <a:xfrm>
                       <a:off x="0" y="0"/>
-                      <a:ext cx="5400000" cy="4149817"/>
+                      <a:ext cx="5400000" cy="4156363"/>
                     </a:xfrm>
                     <a:prstGeom prst="rect"/>
                   </pic:spPr>
@@ -5326,7 +5326,7 @@
       <w:r>
         <w:drawing>
           <wp:inline xmlns:a="http://schemas.openxmlformats.org/drawingml/2006/main" xmlns:pic="http://schemas.openxmlformats.org/drawingml/2006/picture">
-            <wp:extent cx="5400000" cy="2546698"/>
+            <wp:extent cx="5400000" cy="2535327"/>
             <wp:docPr id="7" name="Picture 7"/>
             <wp:cNvGraphicFramePr>
               <a:graphicFrameLocks noChangeAspect="1"/>
@@ -5347,7 +5347,7 @@
                   <pic:spPr>
                     <a:xfrm>
                       <a:off x="0" y="0"/>
-                      <a:ext cx="5400000" cy="2546698"/>
+                      <a:ext cx="5400000" cy="2535327"/>
                     </a:xfrm>
                     <a:prstGeom prst="rect"/>
                   </pic:spPr>
@@ -5380,7 +5380,7 @@
       <w:r>
         <w:drawing>
           <wp:inline xmlns:a="http://schemas.openxmlformats.org/drawingml/2006/main" xmlns:pic="http://schemas.openxmlformats.org/drawingml/2006/picture">
-            <wp:extent cx="5400000" cy="2598791"/>
+            <wp:extent cx="5400000" cy="2189634"/>
             <wp:docPr id="8" name="Picture 8"/>
             <wp:cNvGraphicFramePr>
               <a:graphicFrameLocks noChangeAspect="1"/>
@@ -5401,7 +5401,7 @@
                   <pic:spPr>
                     <a:xfrm>
                       <a:off x="0" y="0"/>
-                      <a:ext cx="5400000" cy="2598791"/>
+                      <a:ext cx="5400000" cy="2189634"/>
                     </a:xfrm>
                     <a:prstGeom prst="rect"/>
                   </pic:spPr>
@@ -6710,7 +6710,7 @@
       <w:r>
         <w:drawing>
           <wp:inline xmlns:a="http://schemas.openxmlformats.org/drawingml/2006/main" xmlns:pic="http://schemas.openxmlformats.org/drawingml/2006/picture">
-            <wp:extent cx="5040000" cy="2339789"/>
+            <wp:extent cx="5040000" cy="2283570"/>
             <wp:docPr id="9" name="Picture 9"/>
             <wp:cNvGraphicFramePr>
               <a:graphicFrameLocks noChangeAspect="1"/>
@@ -6731,7 +6731,7 @@
                   <pic:spPr>
                     <a:xfrm>
                       <a:off x="0" y="0"/>
-                      <a:ext cx="5040000" cy="2339789"/>
+                      <a:ext cx="5040000" cy="2283570"/>
                     </a:xfrm>
                     <a:prstGeom prst="rect"/>
                   </pic:spPr>
@@ -6917,7 +6917,32 @@
           <w:b w:val="0"/>
           <w:sz w:val="21"/>
         </w:rPr>
-        <w:t xml:space="preserve"> double-deep reach racking for A/B reserve + selective single-deep for irregular SKUs + a forward-pick module (carton-flow / shelving) for fast case/each; cantilever for XLONG goods. ≈61% of the envelope for storage + working areas — room to grow.</w:t>
+        <w:t xml:space="preserve"> single-deep pallet racking placed back-to-back (one pallet each side of the rack, every pallet directly reachable from an aisle), 3.0 m reach-truck aisles, 8 levels; selective racks for irregular SKUs + a forward-pick module (carton-flow / shelving) for fast case/each; cantilever for XLONG goods. ≈72% of the envelope for storage + working areas.</w:t>
+      </w:r>
+    </w:p>
+    <w:p>
+      <w:pPr>
+        <w:pStyle w:val="ListBullet"/>
+      </w:pPr>
+      <w:r>
+        <w:rPr>
+          <w:b w:val="0"/>
+          <w:sz w:val="21"/>
+        </w:rPr>
+      </w:r>
+      <w:r>
+        <w:rPr>
+          <w:b/>
+          <w:sz w:val="21"/>
+        </w:rPr>
+        <w:t>Update (Deliverable 3):</w:t>
+      </w:r>
+      <w:r>
+        <w:rPr>
+          <w:b w:val="0"/>
+          <w:sz w:val="21"/>
+        </w:rPr>
+        <w:t xml:space="preserve"> first drafted as double-deep; changed to single-deep back-to-back (team decision: no two-deep racks). The drawn layout already holds 9,504 positions (target ~9,500), and no telescopic forks are needed.</w:t>
       </w:r>
     </w:p>
     <w:p>
@@ -6967,7 +6992,7 @@
           <w:b w:val="0"/>
           <w:sz w:val="21"/>
         </w:rPr>
-        <w:t xml:space="preserve"> reach trucks with telescopic forks (Jungheinrich ETV 216i), pick trolleys for small orders and walkie pallet trucks (EJE 120i) for large orders, rider pallet trucks (ERE 225) at the docks, voice/RF, print-and-apply — sized in Deliverable 2.</w:t>
+        <w:t xml:space="preserve"> reach trucks with standard forks (Jungheinrich ETV 216i), pick trolleys for small orders and walkie pallet trucks (EJE 120i) for large orders, rider pallet trucks (ERE 225) at the docks, voice/RF, print-and-apply — sized in Deliverable 2.</w:t>
       </w:r>
     </w:p>
     <w:p>
@@ -7017,7 +7042,7 @@
           <w:b w:val="0"/>
           <w:sz w:val="21"/>
         </w:rPr>
-        <w:t xml:space="preserve"> fits with buffer, materially lower travel/labour than A, moderate CAPEX — strongest business case.</w:t>
+        <w:t xml:space="preserve"> fits the envelope, materially lower travel/labour than A thanks to slotting and batching, moderate CAPEX — strongest business case.</w:t>
       </w:r>
     </w:p>
     <w:p>
@@ -7654,7 +7679,7 @@
       <w:r>
         <w:drawing>
           <wp:inline xmlns:a="http://schemas.openxmlformats.org/drawingml/2006/main" xmlns:pic="http://schemas.openxmlformats.org/drawingml/2006/picture">
-            <wp:extent cx="4320000" cy="2439261"/>
+            <wp:extent cx="4320000" cy="2409338"/>
             <wp:docPr id="10" name="Picture 10"/>
             <wp:cNvGraphicFramePr>
               <a:graphicFrameLocks noChangeAspect="1"/>
@@ -7675,7 +7700,7 @@
                   <pic:spPr>
                     <a:xfrm>
                       <a:off x="0" y="0"/>
-                      <a:ext cx="4320000" cy="2439261"/>
+                      <a:ext cx="4320000" cy="2409338"/>
                     </a:xfrm>
                     <a:prstGeom prst="rect"/>
                   </pic:spPr>
@@ -7748,7 +7773,7 @@
           <w:b w:val="0"/>
           <w:sz w:val="21"/>
         </w:rPr>
-        <w:t xml:space="preserve"> double-deep holds the corrected target in ≈61% of the envelope, leaving growth room with fewer aisles than selective racking; 75% of order lines are each-picks and 50% of orders single-line → batch/zone picking from a fast-pick area is the biggest labour lever; 48.6% ABC mismatch → velocity slotting is a cheap, high-value win; 73% single-load tail → dense reserve.</w:t>
+        <w:t xml:space="preserve"> single-deep reach racking holds the corrected target in ≈72% of the envelope with every pallet directly accessible (no honeycombing); 75% of order lines are each-picks and 50% of orders single-line → batch/zone picking from a fast-pick area is the biggest labour lever; 48.6% ABC mismatch → velocity slotting is a cheap, high-value win; 73% single-load tail → dense reserve.</w:t>
       </w:r>
     </w:p>
     <w:p>
@@ -7773,7 +7798,7 @@
           <w:b w:val="0"/>
           <w:sz w:val="21"/>
         </w:rPr>
-        <w:t xml:space="preserve"> confirm the 7,000 m² scope (A008); obtain labour/equipment costs (A006) to confirm B vs C in the financial model; validate double-deep against the EURO/K3/XLONG pallet mix.</w:t>
+        <w:t xml:space="preserve"> confirm the 7,000 m² scope (A008); obtain labour/equipment costs (A006) to confirm B vs C in the financial model (done in Deliverable 3); the EURO/K3/XLONG pallet mix was checked against the single-deep racks in Deliverable 3 (long pallets crosswise, &gt; 2.4 m on cantilever).</w:t>
       </w:r>
     </w:p>
     <w:p>
@@ -7797,7 +7822,7 @@
       <w:r>
         <w:drawing>
           <wp:inline xmlns:a="http://schemas.openxmlformats.org/drawingml/2006/main" xmlns:pic="http://schemas.openxmlformats.org/drawingml/2006/picture">
-            <wp:extent cx="5760000" cy="4949334"/>
+            <wp:extent cx="5760000" cy="4832984"/>
             <wp:docPr id="11" name="Picture 11"/>
             <wp:cNvGraphicFramePr>
               <a:graphicFrameLocks noChangeAspect="1"/>
@@ -7818,7 +7843,7 @@
                   <pic:spPr>
                     <a:xfrm>
                       <a:off x="0" y="0"/>
-                      <a:ext cx="5760000" cy="4949334"/>
+                      <a:ext cx="5760000" cy="4832984"/>
                     </a:xfrm>
                     <a:prstGeom prst="rect"/>
                   </pic:spPr>
@@ -8750,6 +8775,100 @@
                 <w:sz w:val="19"/>
               </w:rPr>
               <w:t>Hazardous SKUs: hazard class unknown - PGS 15 (packaged hazardous substances) or PGS 37 (lithium batteries) to be confirmed</w:t>
+            </w:r>
+          </w:p>
+        </w:tc>
+        <w:tc>
+          <w:tcPr>
+            <w:tcW w:type="dxa" w:w="1134"/>
+          </w:tcPr>
+          <w:p>
+            <w:pPr>
+              <w:jc w:val="right"/>
+            </w:pPr>
+            <w:r/>
+            <w:r>
+              <w:rPr>
+                <w:sz w:val="19"/>
+              </w:rPr>
+              <w:t>HIGH</w:t>
+            </w:r>
+          </w:p>
+        </w:tc>
+      </w:tr>
+      <w:tr>
+        <w:tc>
+          <w:tcPr>
+            <w:tcW w:type="dxa" w:w="850"/>
+          </w:tcPr>
+          <w:p>
+            <w:r/>
+            <w:r>
+              <w:rPr>
+                <w:sz w:val="19"/>
+              </w:rPr>
+              <w:t>A030</w:t>
+            </w:r>
+          </w:p>
+        </w:tc>
+        <w:tc>
+          <w:tcPr>
+            <w:tcW w:type="dxa" w:w="6520"/>
+          </w:tcPr>
+          <w:p>
+            <w:r/>
+            <w:r>
+              <w:rPr>
+                <w:sz w:val="19"/>
+              </w:rPr>
+              <w:t>Labour cost per paid hour</w:t>
+            </w:r>
+          </w:p>
+        </w:tc>
+        <w:tc>
+          <w:tcPr>
+            <w:tcW w:type="dxa" w:w="1134"/>
+          </w:tcPr>
+          <w:p>
+            <w:pPr>
+              <w:jc w:val="right"/>
+            </w:pPr>
+            <w:r/>
+            <w:r>
+              <w:rPr>
+                <w:sz w:val="19"/>
+              </w:rPr>
+              <w:t>HIGH</w:t>
+            </w:r>
+          </w:p>
+        </w:tc>
+      </w:tr>
+      <w:tr>
+        <w:tc>
+          <w:tcPr>
+            <w:tcW w:type="dxa" w:w="850"/>
+          </w:tcPr>
+          <w:p>
+            <w:r/>
+            <w:r>
+              <w:rPr>
+                <w:sz w:val="19"/>
+              </w:rPr>
+              <w:t>A033</w:t>
+            </w:r>
+          </w:p>
+        </w:tc>
+        <w:tc>
+          <w:tcPr>
+            <w:tcW w:type="dxa" w:w="6520"/>
+          </w:tcPr>
+          <w:p>
+            <w:r/>
+            <w:r>
+              <w:rPr>
+                <w:sz w:val="19"/>
+              </w:rPr>
+              <w:t>Racking prices</w:t>
             </w:r>
           </w:p>
         </w:tc>

</xml_diff>

<commit_message>
D3 feedback round 2: space checks, long goods, small parts, own KPIs
- Loose containers: zone sized on 568 receipts (91% fit); big containers
  borrow the north half of receiving by blocking door R2 (97% fit).
- Outbound staging (216 m2) and packing (450 m2) validated on measured data.
- Max real length 2.05 m (longer WMS lengths are data errors); long-goods
  module with 4.5 m bays behind a 3.2 m aisle (VDI Ast check, load centre).
- Small slow parts move from pallet locations to bin shelving next to the
  put-wall (frees 1,005 locations); Kardex lifts compared as upgrade path.
- Own design KPIs, labour EUR 20/h, process-only payback, hazmat recount and
  classification by customs code (mostly PGS 37-2).
- Registers A042-A045 and S026-S030; D1/D2/D3, workbook and renders rebuilt.

Co-Authored-By: Claude Opus 5.5 <noreply@anthropic.com>
Claude-Session: https://claude.ai/code/session_019BDu8Mejto8wmgVTUqspvV
</commit_message>
<xml_diff>
--- a/deliverables/Deliverable_1_Analysis.docx
+++ b/deliverables/Deliverable_1_Analysis.docx
@@ -5735,7 +5735,7 @@
               <w:rPr>
                 <w:sz w:val="19"/>
               </w:rPr>
-              <w:t>A000432677 — 1095 cm</w:t>
+              <w:t>A000132438 — 205 cm (realistic maximum ~2 m, door size)</w:t>
             </w:r>
           </w:p>
         </w:tc>
@@ -5749,7 +5749,7 @@
               <w:rPr>
                 <w:sz w:val="19"/>
               </w:rPr>
-              <w:t>26 SKUs longer than 2.4 m -&gt; cantilever racking</w:t>
+              <w:t>76 SKUs recorded longer than 2.05 m (up to 1095 cm for a 0.5 kg item) are data errors (A043)</w:t>
             </w:r>
           </w:p>
         </w:tc>
@@ -6917,7 +6917,7 @@
           <w:b w:val="0"/>
           <w:sz w:val="21"/>
         </w:rPr>
-        <w:t xml:space="preserve"> single-deep pallet racking placed back-to-back (one pallet each side of the rack, every pallet directly reachable from an aisle), 3.0 m reach-truck aisles, 8 levels; selective racks for irregular SKUs + a forward-pick module (carton-flow / shelving) for fast case/each; cantilever for XLONG goods. ≈72% of the envelope for storage + working areas.</w:t>
+        <w:t xml:space="preserve"> single-deep pallet racking placed back-to-back (one pallet each side of the rack, every pallet directly reachable from an aisle), 3.0 m reach-truck aisles, 8 levels; selective racks for irregular SKUs + a forward-pick module (carton-flow / shelving) for fast case/each; a long-goods module for XLONG pallets; bin shelving for small slow parts. ≈72% of the envelope for storage + working areas.</w:t>
       </w:r>
     </w:p>
     <w:p>
@@ -7798,7 +7798,7 @@
           <w:b w:val="0"/>
           <w:sz w:val="21"/>
         </w:rPr>
-        <w:t xml:space="preserve"> confirm the 7,000 m² scope (A008); obtain labour/equipment costs (A006) to confirm B vs C in the financial model (done in Deliverable 3); the EURO/K3/XLONG pallet mix was checked against the single-deep racks in Deliverable 3 (long pallets crosswise, &gt; 2.4 m on cantilever).</w:t>
+        <w:t xml:space="preserve"> confirm the 7,000 m² scope (A008); obtain labour/equipment costs (A006) to confirm B vs C in the financial model (done in Deliverable 3); the EURO/K3/XLONG pallet mix was checked against the single-deep racks in Deliverable 3 (long pallets up to 2.05 m in 4.5 m bays behind a 3.2 m aisle).</w:t>
       </w:r>
     </w:p>
     <w:p>
@@ -8869,6 +8869,53 @@
                 <w:sz w:val="19"/>
               </w:rPr>
               <w:t>Racking prices</w:t>
+            </w:r>
+          </w:p>
+        </w:tc>
+        <w:tc>
+          <w:tcPr>
+            <w:tcW w:type="dxa" w:w="1134"/>
+          </w:tcPr>
+          <w:p>
+            <w:pPr>
+              <w:jc w:val="right"/>
+            </w:pPr>
+            <w:r/>
+            <w:r>
+              <w:rPr>
+                <w:sz w:val="19"/>
+              </w:rPr>
+              <w:t>HIGH</w:t>
+            </w:r>
+          </w:p>
+        </w:tc>
+      </w:tr>
+      <w:tr>
+        <w:tc>
+          <w:tcPr>
+            <w:tcW w:type="dxa" w:w="850"/>
+          </w:tcPr>
+          <w:p>
+            <w:r/>
+            <w:r>
+              <w:rPr>
+                <w:sz w:val="19"/>
+              </w:rPr>
+              <w:t>A042</w:t>
+            </w:r>
+          </w:p>
+        </w:tc>
+        <w:tc>
+          <w:tcPr>
+            <w:tcW w:type="dxa" w:w="6520"/>
+          </w:tcPr>
+          <w:p>
+            <w:r/>
+            <w:r>
+              <w:rPr>
+                <w:sz w:val="19"/>
+              </w:rPr>
+              <w:t>Small parts move from pallet racks to bin shelving</w:t>
             </w:r>
           </w:p>
         </w:tc>

</xml_diff>